<commit_message>
added deployment and modeling and cover for documentation
</commit_message>
<xml_diff>
--- a/Documentation.docx
+++ b/Documentation.docx
@@ -4,8 +4,984 @@
   <w:body>
     <w:p>
       <w:bookmarkStart w:id="0" w:name="_Hlk208879272"/>
+      <w:r>
+        <w:rPr>
+          <w:noProof/>
+        </w:rPr>
+        <w:drawing>
+          <wp:anchor distT="0" distB="0" distL="114300" distR="114300" simplePos="0" relativeHeight="251664895" behindDoc="1" locked="1" layoutInCell="1" allowOverlap="1" wp14:anchorId="116EE4D0" wp14:editId="690D018C">
+            <wp:simplePos x="0" y="0"/>
+            <wp:positionH relativeFrom="page">
+              <wp:align>left</wp:align>
+            </wp:positionH>
+            <wp:positionV relativeFrom="page">
+              <wp:align>top</wp:align>
+            </wp:positionV>
+            <wp:extent cx="7973060" cy="10196195"/>
+            <wp:effectExtent l="0" t="0" r="8890" b="0"/>
+            <wp:wrapNone/>
+            <wp:docPr id="1782065471" name="Picture 1" descr="A blue and black background with red text&#10;&#10;AI-generated content may be incorrect."/>
+            <wp:cNvGraphicFramePr>
+              <a:graphicFrameLocks xmlns:a="http://schemas.openxmlformats.org/drawingml/2006/main" noChangeAspect="1"/>
+            </wp:cNvGraphicFramePr>
+            <a:graphic xmlns:a="http://schemas.openxmlformats.org/drawingml/2006/main">
+              <a:graphicData uri="http://schemas.openxmlformats.org/drawingml/2006/picture">
+                <pic:pic xmlns:pic="http://schemas.openxmlformats.org/drawingml/2006/picture">
+                  <pic:nvPicPr>
+                    <pic:cNvPr id="1782065471" name="Picture 1" descr="A blue and black background with red text&#10;&#10;AI-generated content may be incorrect."/>
+                    <pic:cNvPicPr/>
+                  </pic:nvPicPr>
+                  <pic:blipFill>
+                    <a:blip r:embed="rId8">
+                      <a:extLst>
+                        <a:ext uri="{28A0092B-C50C-407E-A947-70E740481C1C}">
+                          <a14:useLocalDpi xmlns:a14="http://schemas.microsoft.com/office/drawing/2010/main" val="0"/>
+                        </a:ext>
+                      </a:extLst>
+                    </a:blip>
+                    <a:stretch>
+                      <a:fillRect/>
+                    </a:stretch>
+                  </pic:blipFill>
+                  <pic:spPr>
+                    <a:xfrm>
+                      <a:off x="0" y="0"/>
+                      <a:ext cx="7973060" cy="10196195"/>
+                    </a:xfrm>
+                    <a:prstGeom prst="rect">
+                      <a:avLst/>
+                    </a:prstGeom>
+                  </pic:spPr>
+                </pic:pic>
+              </a:graphicData>
+            </a:graphic>
+            <wp14:sizeRelH relativeFrom="margin">
+              <wp14:pctWidth>0</wp14:pctWidth>
+            </wp14:sizeRelH>
+            <wp14:sizeRelV relativeFrom="margin">
+              <wp14:pctHeight>0</wp14:pctHeight>
+            </wp14:sizeRelV>
+          </wp:anchor>
+        </w:drawing>
+      </w:r>
     </w:p>
     <w:p>
+      <w:r>
+        <w:rPr>
+          <w:noProof/>
+        </w:rPr>
+        <mc:AlternateContent>
+          <mc:Choice Requires="wps">
+            <w:drawing>
+              <wp:anchor distT="45720" distB="45720" distL="114300" distR="114300" simplePos="0" relativeHeight="251672576" behindDoc="0" locked="0" layoutInCell="1" allowOverlap="1" wp14:anchorId="36CD9ED6" wp14:editId="2BFCF7B0">
+                <wp:simplePos x="0" y="0"/>
+                <wp:positionH relativeFrom="margin">
+                  <wp:align>center</wp:align>
+                </wp:positionH>
+                <wp:positionV relativeFrom="paragraph">
+                  <wp:posOffset>6044565</wp:posOffset>
+                </wp:positionV>
+                <wp:extent cx="3873500" cy="1242695"/>
+                <wp:effectExtent l="0" t="0" r="0" b="0"/>
+                <wp:wrapSquare wrapText="bothSides"/>
+                <wp:docPr id="2099693704" name="Text Box 2"/>
+                <wp:cNvGraphicFramePr>
+                  <a:graphicFrameLocks xmlns:a="http://schemas.openxmlformats.org/drawingml/2006/main"/>
+                </wp:cNvGraphicFramePr>
+                <a:graphic xmlns:a="http://schemas.openxmlformats.org/drawingml/2006/main">
+                  <a:graphicData uri="http://schemas.microsoft.com/office/word/2010/wordprocessingShape">
+                    <wps:wsp>
+                      <wps:cNvSpPr txBox="1">
+                        <a:spLocks noChangeArrowheads="1"/>
+                      </wps:cNvSpPr>
+                      <wps:spPr bwMode="auto">
+                        <a:xfrm>
+                          <a:off x="0" y="0"/>
+                          <a:ext cx="3873500" cy="1242695"/>
+                        </a:xfrm>
+                        <a:prstGeom prst="rect">
+                          <a:avLst/>
+                        </a:prstGeom>
+                        <a:noFill/>
+                        <a:ln w="9525">
+                          <a:noFill/>
+                          <a:miter lim="800000"/>
+                          <a:headEnd/>
+                          <a:tailEnd/>
+                        </a:ln>
+                      </wps:spPr>
+                      <wps:txbx>
+                        <w:txbxContent>
+                          <w:p>
+                            <w:pPr>
+                              <w:rPr>
+                                <w:b/>
+                                <w:bCs/>
+                                <w:color w:val="00B0F0"/>
+                                <w:sz w:val="72"/>
+                                <w:szCs w:val="72"/>
+                              </w:rPr>
+                            </w:pPr>
+                            <w:r>
+                              <w:rPr>
+                                <w:b/>
+                                <w:bCs/>
+                                <w:color w:val="00B0F0"/>
+                                <w:sz w:val="72"/>
+                                <w:szCs w:val="72"/>
+                              </w:rPr>
+                              <w:t>Supervised BY:</w:t>
+                            </w:r>
+                            <w:r>
+                              <w:rPr>
+                                <w:b/>
+                                <w:bCs/>
+                                <w:color w:val="00B0F0"/>
+                                <w:sz w:val="72"/>
+                                <w:szCs w:val="72"/>
+                              </w:rPr>
+                              <w:t xml:space="preserve"> </w:t>
+                            </w:r>
+                          </w:p>
+                          <w:p>
+                            <w:pPr>
+                              <w:pStyle w:val="ListParagraph"/>
+                              <w:numPr>
+                                <w:ilvl w:val="0"/>
+                                <w:numId w:val="22"/>
+                              </w:numPr>
+                              <w:spacing w:after="0"/>
+                              <w:rPr>
+                                <w:b/>
+                                <w:bCs/>
+                                <w:color w:val="FFFFFF" w:themeColor="background1"/>
+                                <w:sz w:val="36"/>
+                                <w:szCs w:val="36"/>
+                              </w:rPr>
+                            </w:pPr>
+                            <w:r>
+                              <w:rPr>
+                                <w:b/>
+                                <w:bCs/>
+                                <w:color w:val="FFFFFF" w:themeColor="background1"/>
+                                <w:sz w:val="36"/>
+                                <w:szCs w:val="36"/>
+                              </w:rPr>
+                              <w:t>ENG: Lila Ahmed</w:t>
+                            </w:r>
+                          </w:p>
+                          <w:p>
+                            <w:pPr>
+                              <w:rPr>
+                                <w:b/>
+                                <w:bCs/>
+                                <w:color w:val="FFFFFF" w:themeColor="background1"/>
+                                <w:sz w:val="72"/>
+                                <w:szCs w:val="72"/>
+                              </w:rPr>
+                            </w:pPr>
+                          </w:p>
+                          <w:p>
+                            <w:pPr>
+                              <w:rPr>
+                                <w:b/>
+                                <w:bCs/>
+                                <w:color w:val="FFFFFF" w:themeColor="background1"/>
+                                <w:sz w:val="72"/>
+                                <w:szCs w:val="72"/>
+                              </w:rPr>
+                            </w:pPr>
+                          </w:p>
+                        </w:txbxContent>
+                      </wps:txbx>
+                      <wps:bodyPr rot="0" vert="horz" wrap="square" lIns="91440" tIns="45720" rIns="91440" bIns="45720" anchor="t" anchorCtr="0">
+                        <a:noAutofit/>
+                      </wps:bodyPr>
+                    </wps:wsp>
+                  </a:graphicData>
+                </a:graphic>
+                <wp14:sizeRelH relativeFrom="margin">
+                  <wp14:pctWidth>0</wp14:pctWidth>
+                </wp14:sizeRelH>
+                <wp14:sizeRelV relativeFrom="margin">
+                  <wp14:pctHeight>0</wp14:pctHeight>
+                </wp14:sizeRelV>
+              </wp:anchor>
+            </w:drawing>
+          </mc:Choice>
+          <mc:Fallback>
+            <w:pict>
+              <v:shapetype w14:anchorId="36CD9ED6" id="_x0000_t202" coordsize="21600,21600" o:spt="202" path="m,l,21600r21600,l21600,xe">
+                <v:stroke joinstyle="miter"/>
+                <v:path gradientshapeok="t" o:connecttype="rect"/>
+              </v:shapetype>
+              <v:shape id="Text Box 2" o:spid="_x0000_s1026" type="#_x0000_t202" style="position:absolute;margin-left:0;margin-top:475.95pt;width:305pt;height:97.85pt;z-index:251672576;visibility:visible;mso-wrap-style:square;mso-width-percent:0;mso-height-percent:0;mso-wrap-distance-left:9pt;mso-wrap-distance-top:3.6pt;mso-wrap-distance-right:9pt;mso-wrap-distance-bottom:3.6pt;mso-position-horizontal:center;mso-position-horizontal-relative:margin;mso-position-vertical:absolute;mso-position-vertical-relative:text;mso-width-percent:0;mso-height-percent:0;mso-width-relative:margin;mso-height-relative:margin;v-text-anchor:top" o:gfxdata="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" filled="f" stroked="f">
+                <v:textbox>
+                  <w:txbxContent>
+                    <w:p>
+                      <w:pPr>
+                        <w:rPr>
+                          <w:b/>
+                          <w:bCs/>
+                          <w:color w:val="00B0F0"/>
+                          <w:sz w:val="72"/>
+                          <w:szCs w:val="72"/>
+                        </w:rPr>
+                      </w:pPr>
+                      <w:r>
+                        <w:rPr>
+                          <w:b/>
+                          <w:bCs/>
+                          <w:color w:val="00B0F0"/>
+                          <w:sz w:val="72"/>
+                          <w:szCs w:val="72"/>
+                        </w:rPr>
+                        <w:t>Supervised BY:</w:t>
+                      </w:r>
+                      <w:r>
+                        <w:rPr>
+                          <w:b/>
+                          <w:bCs/>
+                          <w:color w:val="00B0F0"/>
+                          <w:sz w:val="72"/>
+                          <w:szCs w:val="72"/>
+                        </w:rPr>
+                        <w:t xml:space="preserve"> </w:t>
+                      </w:r>
+                    </w:p>
+                    <w:p>
+                      <w:pPr>
+                        <w:pStyle w:val="ListParagraph"/>
+                        <w:numPr>
+                          <w:ilvl w:val="0"/>
+                          <w:numId w:val="22"/>
+                        </w:numPr>
+                        <w:spacing w:after="0"/>
+                        <w:rPr>
+                          <w:b/>
+                          <w:bCs/>
+                          <w:color w:val="FFFFFF" w:themeColor="background1"/>
+                          <w:sz w:val="36"/>
+                          <w:szCs w:val="36"/>
+                        </w:rPr>
+                      </w:pPr>
+                      <w:r>
+                        <w:rPr>
+                          <w:b/>
+                          <w:bCs/>
+                          <w:color w:val="FFFFFF" w:themeColor="background1"/>
+                          <w:sz w:val="36"/>
+                          <w:szCs w:val="36"/>
+                        </w:rPr>
+                        <w:t>ENG: Lila Ahmed</w:t>
+                      </w:r>
+                    </w:p>
+                    <w:p>
+                      <w:pPr>
+                        <w:rPr>
+                          <w:b/>
+                          <w:bCs/>
+                          <w:color w:val="FFFFFF" w:themeColor="background1"/>
+                          <w:sz w:val="72"/>
+                          <w:szCs w:val="72"/>
+                        </w:rPr>
+                      </w:pPr>
+                    </w:p>
+                    <w:p>
+                      <w:pPr>
+                        <w:rPr>
+                          <w:b/>
+                          <w:bCs/>
+                          <w:color w:val="FFFFFF" w:themeColor="background1"/>
+                          <w:sz w:val="72"/>
+                          <w:szCs w:val="72"/>
+                        </w:rPr>
+                      </w:pPr>
+                    </w:p>
+                  </w:txbxContent>
+                </v:textbox>
+                <w10:wrap type="square" anchorx="margin"/>
+              </v:shape>
+            </w:pict>
+          </mc:Fallback>
+        </mc:AlternateContent>
+      </w:r>
+      <w:r>
+        <w:rPr>
+          <w:noProof/>
+        </w:rPr>
+        <mc:AlternateContent>
+          <mc:Choice Requires="wps">
+            <w:drawing>
+              <wp:anchor distT="45720" distB="45720" distL="114300" distR="114300" simplePos="0" relativeHeight="251670528" behindDoc="0" locked="0" layoutInCell="1" allowOverlap="1" wp14:anchorId="7A428395" wp14:editId="17B4F1D7">
+                <wp:simplePos x="0" y="0"/>
+                <wp:positionH relativeFrom="page">
+                  <wp:posOffset>1719580</wp:posOffset>
+                </wp:positionH>
+                <wp:positionV relativeFrom="paragraph">
+                  <wp:posOffset>3122658</wp:posOffset>
+                </wp:positionV>
+                <wp:extent cx="4430395" cy="2982595"/>
+                <wp:effectExtent l="0" t="0" r="0" b="0"/>
+                <wp:wrapSquare wrapText="bothSides"/>
+                <wp:docPr id="1562701881" name="Text Box 2"/>
+                <wp:cNvGraphicFramePr>
+                  <a:graphicFrameLocks xmlns:a="http://schemas.openxmlformats.org/drawingml/2006/main"/>
+                </wp:cNvGraphicFramePr>
+                <a:graphic xmlns:a="http://schemas.openxmlformats.org/drawingml/2006/main">
+                  <a:graphicData uri="http://schemas.microsoft.com/office/word/2010/wordprocessingShape">
+                    <wps:wsp>
+                      <wps:cNvSpPr txBox="1">
+                        <a:spLocks noChangeArrowheads="1"/>
+                      </wps:cNvSpPr>
+                      <wps:spPr bwMode="auto">
+                        <a:xfrm>
+                          <a:off x="0" y="0"/>
+                          <a:ext cx="4430395" cy="2982595"/>
+                        </a:xfrm>
+                        <a:prstGeom prst="rect">
+                          <a:avLst/>
+                        </a:prstGeom>
+                        <a:noFill/>
+                        <a:ln w="9525">
+                          <a:noFill/>
+                          <a:miter lim="800000"/>
+                          <a:headEnd/>
+                          <a:tailEnd/>
+                        </a:ln>
+                      </wps:spPr>
+                      <wps:txbx>
+                        <w:txbxContent>
+                          <w:p>
+                            <w:pPr>
+                              <w:rPr>
+                                <w:b/>
+                                <w:bCs/>
+                                <w:color w:val="00B0F0"/>
+                                <w:sz w:val="72"/>
+                                <w:szCs w:val="72"/>
+                              </w:rPr>
+                            </w:pPr>
+                            <w:proofErr w:type="gramStart"/>
+                            <w:r>
+                              <w:rPr>
+                                <w:b/>
+                                <w:bCs/>
+                                <w:color w:val="00B0F0"/>
+                                <w:sz w:val="72"/>
+                                <w:szCs w:val="72"/>
+                              </w:rPr>
+                              <w:t>BY :</w:t>
+                            </w:r>
+                            <w:proofErr w:type="gramEnd"/>
+                            <w:r>
+                              <w:rPr>
+                                <w:b/>
+                                <w:bCs/>
+                                <w:color w:val="00B0F0"/>
+                                <w:sz w:val="72"/>
+                                <w:szCs w:val="72"/>
+                              </w:rPr>
+                              <w:t xml:space="preserve"> </w:t>
+                            </w:r>
+                          </w:p>
+                          <w:p>
+                            <w:pPr>
+                              <w:pStyle w:val="ListParagraph"/>
+                              <w:numPr>
+                                <w:ilvl w:val="0"/>
+                                <w:numId w:val="22"/>
+                              </w:numPr>
+                              <w:spacing w:after="0"/>
+                              <w:rPr>
+                                <w:b/>
+                                <w:bCs/>
+                                <w:color w:val="FFFFFF" w:themeColor="background1"/>
+                                <w:sz w:val="36"/>
+                                <w:szCs w:val="36"/>
+                              </w:rPr>
+                            </w:pPr>
+                            <w:r>
+                              <w:rPr>
+                                <w:b/>
+                                <w:bCs/>
+                                <w:color w:val="FFFFFF" w:themeColor="background1"/>
+                                <w:sz w:val="36"/>
+                                <w:szCs w:val="36"/>
+                              </w:rPr>
+                              <w:t>Yousif Salah Muhammad</w:t>
+                            </w:r>
+                          </w:p>
+                          <w:p>
+                            <w:pPr>
+                              <w:pStyle w:val="ListParagraph"/>
+                              <w:numPr>
+                                <w:ilvl w:val="0"/>
+                                <w:numId w:val="22"/>
+                              </w:numPr>
+                              <w:spacing w:after="0"/>
+                              <w:rPr>
+                                <w:b/>
+                                <w:bCs/>
+                                <w:color w:val="FFFFFF" w:themeColor="background1"/>
+                                <w:sz w:val="36"/>
+                                <w:szCs w:val="36"/>
+                              </w:rPr>
+                            </w:pPr>
+                            <w:r>
+                              <w:rPr>
+                                <w:b/>
+                                <w:bCs/>
+                                <w:color w:val="FFFFFF" w:themeColor="background1"/>
+                                <w:sz w:val="36"/>
+                                <w:szCs w:val="36"/>
+                              </w:rPr>
+                              <w:t xml:space="preserve">Asmaa Ali </w:t>
+                            </w:r>
+                            <w:proofErr w:type="spellStart"/>
+                            <w:r>
+                              <w:rPr>
+                                <w:b/>
+                                <w:bCs/>
+                                <w:color w:val="FFFFFF" w:themeColor="background1"/>
+                                <w:sz w:val="36"/>
+                                <w:szCs w:val="36"/>
+                              </w:rPr>
+                              <w:t>Abdelaaty</w:t>
+                            </w:r>
+                            <w:proofErr w:type="spellEnd"/>
+                          </w:p>
+                          <w:p>
+                            <w:pPr>
+                              <w:pStyle w:val="ListParagraph"/>
+                              <w:numPr>
+                                <w:ilvl w:val="0"/>
+                                <w:numId w:val="22"/>
+                              </w:numPr>
+                              <w:spacing w:after="0"/>
+                              <w:rPr>
+                                <w:b/>
+                                <w:bCs/>
+                                <w:color w:val="FFFFFF" w:themeColor="background1"/>
+                                <w:sz w:val="36"/>
+                                <w:szCs w:val="36"/>
+                              </w:rPr>
+                            </w:pPr>
+                            <w:r>
+                              <w:rPr>
+                                <w:b/>
+                                <w:bCs/>
+                                <w:color w:val="FFFFFF" w:themeColor="background1"/>
+                                <w:sz w:val="36"/>
+                                <w:szCs w:val="36"/>
+                              </w:rPr>
+                              <w:t>Abdelrahman Osama Mahmoud</w:t>
+                            </w:r>
+                          </w:p>
+                          <w:p>
+                            <w:pPr>
+                              <w:pStyle w:val="ListParagraph"/>
+                              <w:numPr>
+                                <w:ilvl w:val="0"/>
+                                <w:numId w:val="22"/>
+                              </w:numPr>
+                              <w:spacing w:after="0"/>
+                              <w:rPr>
+                                <w:b/>
+                                <w:bCs/>
+                                <w:color w:val="FFFFFF" w:themeColor="background1"/>
+                                <w:sz w:val="36"/>
+                                <w:szCs w:val="36"/>
+                              </w:rPr>
+                            </w:pPr>
+                            <w:r>
+                              <w:rPr>
+                                <w:b/>
+                                <w:bCs/>
+                                <w:color w:val="FFFFFF" w:themeColor="background1"/>
+                                <w:sz w:val="36"/>
+                                <w:szCs w:val="36"/>
+                              </w:rPr>
+                              <w:t>Esraa Taha Abdelhasseb</w:t>
+                            </w:r>
+                          </w:p>
+                          <w:p>
+                            <w:pPr>
+                              <w:pStyle w:val="ListParagraph"/>
+                              <w:numPr>
+                                <w:ilvl w:val="0"/>
+                                <w:numId w:val="22"/>
+                              </w:numPr>
+                              <w:spacing w:after="0"/>
+                              <w:rPr>
+                                <w:b/>
+                                <w:bCs/>
+                                <w:color w:val="FFFFFF" w:themeColor="background1"/>
+                                <w:sz w:val="36"/>
+                                <w:szCs w:val="36"/>
+                              </w:rPr>
+                            </w:pPr>
+                            <w:r>
+                              <w:rPr>
+                                <w:b/>
+                                <w:bCs/>
+                                <w:color w:val="FFFFFF" w:themeColor="background1"/>
+                                <w:sz w:val="36"/>
+                                <w:szCs w:val="36"/>
+                              </w:rPr>
+                              <w:t xml:space="preserve">Aml Abdullah </w:t>
+                            </w:r>
+                            <w:proofErr w:type="spellStart"/>
+                            <w:r>
+                              <w:rPr>
+                                <w:b/>
+                                <w:bCs/>
+                                <w:color w:val="FFFFFF" w:themeColor="background1"/>
+                                <w:sz w:val="36"/>
+                                <w:szCs w:val="36"/>
+                              </w:rPr>
+                              <w:t>shehata</w:t>
+                            </w:r>
+                            <w:proofErr w:type="spellEnd"/>
+                          </w:p>
+                          <w:p>
+                            <w:pPr>
+                              <w:pStyle w:val="ListParagraph"/>
+                              <w:numPr>
+                                <w:ilvl w:val="0"/>
+                                <w:numId w:val="22"/>
+                              </w:numPr>
+                              <w:spacing w:after="0"/>
+                              <w:rPr>
+                                <w:b/>
+                                <w:bCs/>
+                                <w:color w:val="FFFFFF" w:themeColor="background1"/>
+                                <w:sz w:val="36"/>
+                                <w:szCs w:val="36"/>
+                              </w:rPr>
+                            </w:pPr>
+                            <w:r>
+                              <w:rPr>
+                                <w:b/>
+                                <w:bCs/>
+                                <w:color w:val="FFFFFF" w:themeColor="background1"/>
+                                <w:sz w:val="36"/>
+                                <w:szCs w:val="36"/>
+                              </w:rPr>
+                              <w:t>Hanan Hamdy Mostafa</w:t>
+                            </w:r>
+                          </w:p>
+                          <w:p>
+                            <w:pPr>
+                              <w:rPr>
+                                <w:b/>
+                                <w:bCs/>
+                                <w:color w:val="FFFFFF" w:themeColor="background1"/>
+                                <w:sz w:val="72"/>
+                                <w:szCs w:val="72"/>
+                              </w:rPr>
+                            </w:pPr>
+                          </w:p>
+                          <w:p>
+                            <w:pPr>
+                              <w:rPr>
+                                <w:b/>
+                                <w:bCs/>
+                                <w:color w:val="FFFFFF" w:themeColor="background1"/>
+                                <w:sz w:val="72"/>
+                                <w:szCs w:val="72"/>
+                              </w:rPr>
+                            </w:pPr>
+                          </w:p>
+                        </w:txbxContent>
+                      </wps:txbx>
+                      <wps:bodyPr rot="0" vert="horz" wrap="square" lIns="91440" tIns="45720" rIns="91440" bIns="45720" anchor="t" anchorCtr="0">
+                        <a:noAutofit/>
+                      </wps:bodyPr>
+                    </wps:wsp>
+                  </a:graphicData>
+                </a:graphic>
+                <wp14:sizeRelH relativeFrom="margin">
+                  <wp14:pctWidth>0</wp14:pctWidth>
+                </wp14:sizeRelH>
+                <wp14:sizeRelV relativeFrom="margin">
+                  <wp14:pctHeight>0</wp14:pctHeight>
+                </wp14:sizeRelV>
+              </wp:anchor>
+            </w:drawing>
+          </mc:Choice>
+          <mc:Fallback>
+            <w:pict>
+              <v:shape w14:anchorId="7A428395" id="_x0000_s1027" type="#_x0000_t202" style="position:absolute;margin-left:135.4pt;margin-top:245.9pt;width:348.85pt;height:234.85pt;z-index:251670528;visibility:visible;mso-wrap-style:square;mso-width-percent:0;mso-height-percent:0;mso-wrap-distance-left:9pt;mso-wrap-distance-top:3.6pt;mso-wrap-distance-right:9pt;mso-wrap-distance-bottom:3.6pt;mso-position-horizontal:absolute;mso-position-horizontal-relative:page;mso-position-vertical:absolute;mso-position-vertical-relative:text;mso-width-percent:0;mso-height-percent:0;mso-width-relative:margin;mso-height-relative:margin;v-text-anchor:top" o:gfxdata="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" filled="f" stroked="f">
+                <v:textbox>
+                  <w:txbxContent>
+                    <w:p>
+                      <w:pPr>
+                        <w:rPr>
+                          <w:b/>
+                          <w:bCs/>
+                          <w:color w:val="00B0F0"/>
+                          <w:sz w:val="72"/>
+                          <w:szCs w:val="72"/>
+                        </w:rPr>
+                      </w:pPr>
+                      <w:proofErr w:type="gramStart"/>
+                      <w:r>
+                        <w:rPr>
+                          <w:b/>
+                          <w:bCs/>
+                          <w:color w:val="00B0F0"/>
+                          <w:sz w:val="72"/>
+                          <w:szCs w:val="72"/>
+                        </w:rPr>
+                        <w:t>BY :</w:t>
+                      </w:r>
+                      <w:proofErr w:type="gramEnd"/>
+                      <w:r>
+                        <w:rPr>
+                          <w:b/>
+                          <w:bCs/>
+                          <w:color w:val="00B0F0"/>
+                          <w:sz w:val="72"/>
+                          <w:szCs w:val="72"/>
+                        </w:rPr>
+                        <w:t xml:space="preserve"> </w:t>
+                      </w:r>
+                    </w:p>
+                    <w:p>
+                      <w:pPr>
+                        <w:pStyle w:val="ListParagraph"/>
+                        <w:numPr>
+                          <w:ilvl w:val="0"/>
+                          <w:numId w:val="22"/>
+                        </w:numPr>
+                        <w:spacing w:after="0"/>
+                        <w:rPr>
+                          <w:b/>
+                          <w:bCs/>
+                          <w:color w:val="FFFFFF" w:themeColor="background1"/>
+                          <w:sz w:val="36"/>
+                          <w:szCs w:val="36"/>
+                        </w:rPr>
+                      </w:pPr>
+                      <w:r>
+                        <w:rPr>
+                          <w:b/>
+                          <w:bCs/>
+                          <w:color w:val="FFFFFF" w:themeColor="background1"/>
+                          <w:sz w:val="36"/>
+                          <w:szCs w:val="36"/>
+                        </w:rPr>
+                        <w:t>Yousif Salah Muhammad</w:t>
+                      </w:r>
+                    </w:p>
+                    <w:p>
+                      <w:pPr>
+                        <w:pStyle w:val="ListParagraph"/>
+                        <w:numPr>
+                          <w:ilvl w:val="0"/>
+                          <w:numId w:val="22"/>
+                        </w:numPr>
+                        <w:spacing w:after="0"/>
+                        <w:rPr>
+                          <w:b/>
+                          <w:bCs/>
+                          <w:color w:val="FFFFFF" w:themeColor="background1"/>
+                          <w:sz w:val="36"/>
+                          <w:szCs w:val="36"/>
+                        </w:rPr>
+                      </w:pPr>
+                      <w:r>
+                        <w:rPr>
+                          <w:b/>
+                          <w:bCs/>
+                          <w:color w:val="FFFFFF" w:themeColor="background1"/>
+                          <w:sz w:val="36"/>
+                          <w:szCs w:val="36"/>
+                        </w:rPr>
+                        <w:t xml:space="preserve">Asmaa Ali </w:t>
+                      </w:r>
+                      <w:proofErr w:type="spellStart"/>
+                      <w:r>
+                        <w:rPr>
+                          <w:b/>
+                          <w:bCs/>
+                          <w:color w:val="FFFFFF" w:themeColor="background1"/>
+                          <w:sz w:val="36"/>
+                          <w:szCs w:val="36"/>
+                        </w:rPr>
+                        <w:t>Abdelaaty</w:t>
+                      </w:r>
+                      <w:proofErr w:type="spellEnd"/>
+                    </w:p>
+                    <w:p>
+                      <w:pPr>
+                        <w:pStyle w:val="ListParagraph"/>
+                        <w:numPr>
+                          <w:ilvl w:val="0"/>
+                          <w:numId w:val="22"/>
+                        </w:numPr>
+                        <w:spacing w:after="0"/>
+                        <w:rPr>
+                          <w:b/>
+                          <w:bCs/>
+                          <w:color w:val="FFFFFF" w:themeColor="background1"/>
+                          <w:sz w:val="36"/>
+                          <w:szCs w:val="36"/>
+                        </w:rPr>
+                      </w:pPr>
+                      <w:r>
+                        <w:rPr>
+                          <w:b/>
+                          <w:bCs/>
+                          <w:color w:val="FFFFFF" w:themeColor="background1"/>
+                          <w:sz w:val="36"/>
+                          <w:szCs w:val="36"/>
+                        </w:rPr>
+                        <w:t>Abdelrahman Osama Mahmoud</w:t>
+                      </w:r>
+                    </w:p>
+                    <w:p>
+                      <w:pPr>
+                        <w:pStyle w:val="ListParagraph"/>
+                        <w:numPr>
+                          <w:ilvl w:val="0"/>
+                          <w:numId w:val="22"/>
+                        </w:numPr>
+                        <w:spacing w:after="0"/>
+                        <w:rPr>
+                          <w:b/>
+                          <w:bCs/>
+                          <w:color w:val="FFFFFF" w:themeColor="background1"/>
+                          <w:sz w:val="36"/>
+                          <w:szCs w:val="36"/>
+                        </w:rPr>
+                      </w:pPr>
+                      <w:r>
+                        <w:rPr>
+                          <w:b/>
+                          <w:bCs/>
+                          <w:color w:val="FFFFFF" w:themeColor="background1"/>
+                          <w:sz w:val="36"/>
+                          <w:szCs w:val="36"/>
+                        </w:rPr>
+                        <w:t>Esraa Taha Abdelhasseb</w:t>
+                      </w:r>
+                    </w:p>
+                    <w:p>
+                      <w:pPr>
+                        <w:pStyle w:val="ListParagraph"/>
+                        <w:numPr>
+                          <w:ilvl w:val="0"/>
+                          <w:numId w:val="22"/>
+                        </w:numPr>
+                        <w:spacing w:after="0"/>
+                        <w:rPr>
+                          <w:b/>
+                          <w:bCs/>
+                          <w:color w:val="FFFFFF" w:themeColor="background1"/>
+                          <w:sz w:val="36"/>
+                          <w:szCs w:val="36"/>
+                        </w:rPr>
+                      </w:pPr>
+                      <w:r>
+                        <w:rPr>
+                          <w:b/>
+                          <w:bCs/>
+                          <w:color w:val="FFFFFF" w:themeColor="background1"/>
+                          <w:sz w:val="36"/>
+                          <w:szCs w:val="36"/>
+                        </w:rPr>
+                        <w:t xml:space="preserve">Aml Abdullah </w:t>
+                      </w:r>
+                      <w:proofErr w:type="spellStart"/>
+                      <w:r>
+                        <w:rPr>
+                          <w:b/>
+                          <w:bCs/>
+                          <w:color w:val="FFFFFF" w:themeColor="background1"/>
+                          <w:sz w:val="36"/>
+                          <w:szCs w:val="36"/>
+                        </w:rPr>
+                        <w:t>shehata</w:t>
+                      </w:r>
+                      <w:proofErr w:type="spellEnd"/>
+                    </w:p>
+                    <w:p>
+                      <w:pPr>
+                        <w:pStyle w:val="ListParagraph"/>
+                        <w:numPr>
+                          <w:ilvl w:val="0"/>
+                          <w:numId w:val="22"/>
+                        </w:numPr>
+                        <w:spacing w:after="0"/>
+                        <w:rPr>
+                          <w:b/>
+                          <w:bCs/>
+                          <w:color w:val="FFFFFF" w:themeColor="background1"/>
+                          <w:sz w:val="36"/>
+                          <w:szCs w:val="36"/>
+                        </w:rPr>
+                      </w:pPr>
+                      <w:r>
+                        <w:rPr>
+                          <w:b/>
+                          <w:bCs/>
+                          <w:color w:val="FFFFFF" w:themeColor="background1"/>
+                          <w:sz w:val="36"/>
+                          <w:szCs w:val="36"/>
+                        </w:rPr>
+                        <w:t>Hanan Hamdy Mostafa</w:t>
+                      </w:r>
+                    </w:p>
+                    <w:p>
+                      <w:pPr>
+                        <w:rPr>
+                          <w:b/>
+                          <w:bCs/>
+                          <w:color w:val="FFFFFF" w:themeColor="background1"/>
+                          <w:sz w:val="72"/>
+                          <w:szCs w:val="72"/>
+                        </w:rPr>
+                      </w:pPr>
+                    </w:p>
+                    <w:p>
+                      <w:pPr>
+                        <w:rPr>
+                          <w:b/>
+                          <w:bCs/>
+                          <w:color w:val="FFFFFF" w:themeColor="background1"/>
+                          <w:sz w:val="72"/>
+                          <w:szCs w:val="72"/>
+                        </w:rPr>
+                      </w:pPr>
+                    </w:p>
+                  </w:txbxContent>
+                </v:textbox>
+                <w10:wrap type="square" anchorx="page"/>
+              </v:shape>
+            </w:pict>
+          </mc:Fallback>
+        </mc:AlternateContent>
+      </w:r>
+      <w:r>
+        <w:rPr>
+          <w:noProof/>
+        </w:rPr>
+        <mc:AlternateContent>
+          <mc:Choice Requires="wps">
+            <w:drawing>
+              <wp:anchor distT="45720" distB="45720" distL="114300" distR="114300" simplePos="0" relativeHeight="251668480" behindDoc="0" locked="0" layoutInCell="1" allowOverlap="1" wp14:anchorId="56988CD0" wp14:editId="23D5DB4C">
+                <wp:simplePos x="0" y="0"/>
+                <wp:positionH relativeFrom="page">
+                  <wp:posOffset>3360964</wp:posOffset>
+                </wp:positionH>
+                <wp:positionV relativeFrom="paragraph">
+                  <wp:posOffset>964928</wp:posOffset>
+                </wp:positionV>
+                <wp:extent cx="3790950" cy="1404620"/>
+                <wp:effectExtent l="0" t="0" r="0" b="0"/>
+                <wp:wrapSquare wrapText="bothSides"/>
+                <wp:docPr id="217" name="Text Box 2"/>
+                <wp:cNvGraphicFramePr>
+                  <a:graphicFrameLocks xmlns:a="http://schemas.openxmlformats.org/drawingml/2006/main"/>
+                </wp:cNvGraphicFramePr>
+                <a:graphic xmlns:a="http://schemas.openxmlformats.org/drawingml/2006/main">
+                  <a:graphicData uri="http://schemas.microsoft.com/office/word/2010/wordprocessingShape">
+                    <wps:wsp>
+                      <wps:cNvSpPr txBox="1">
+                        <a:spLocks noChangeArrowheads="1"/>
+                      </wps:cNvSpPr>
+                      <wps:spPr bwMode="auto">
+                        <a:xfrm>
+                          <a:off x="0" y="0"/>
+                          <a:ext cx="3790950" cy="1404620"/>
+                        </a:xfrm>
+                        <a:prstGeom prst="rect">
+                          <a:avLst/>
+                        </a:prstGeom>
+                        <a:noFill/>
+                        <a:ln w="9525">
+                          <a:noFill/>
+                          <a:miter lim="800000"/>
+                          <a:headEnd/>
+                          <a:tailEnd/>
+                        </a:ln>
+                      </wps:spPr>
+                      <wps:txbx>
+                        <w:txbxContent>
+                          <w:p>
+                            <w:pPr>
+                              <w:rPr>
+                                <w:b/>
+                                <w:bCs/>
+                                <w:color w:val="FFFFFF" w:themeColor="background1"/>
+                                <w:sz w:val="72"/>
+                                <w:szCs w:val="72"/>
+                              </w:rPr>
+                            </w:pPr>
+                            <w:r>
+                              <w:rPr>
+                                <w:b/>
+                                <w:bCs/>
+                                <w:color w:val="FFFFFF" w:themeColor="background1"/>
+                                <w:sz w:val="72"/>
+                                <w:szCs w:val="72"/>
+                              </w:rPr>
+                              <w:t>Sales forecasting</w:t>
+                            </w:r>
+                          </w:p>
+                        </w:txbxContent>
+                      </wps:txbx>
+                      <wps:bodyPr rot="0" vert="horz" wrap="square" lIns="91440" tIns="45720" rIns="91440" bIns="45720" anchor="t" anchorCtr="0">
+                        <a:spAutoFit/>
+                      </wps:bodyPr>
+                    </wps:wsp>
+                  </a:graphicData>
+                </a:graphic>
+                <wp14:sizeRelH relativeFrom="margin">
+                  <wp14:pctWidth>0</wp14:pctWidth>
+                </wp14:sizeRelH>
+                <wp14:sizeRelV relativeFrom="margin">
+                  <wp14:pctHeight>20000</wp14:pctHeight>
+                </wp14:sizeRelV>
+              </wp:anchor>
+            </w:drawing>
+          </mc:Choice>
+          <mc:Fallback>
+            <w:pict>
+              <v:shape w14:anchorId="56988CD0" id="_x0000_s1028" type="#_x0000_t202" style="position:absolute;margin-left:264.65pt;margin-top:76pt;width:298.5pt;height:110.6pt;z-index:251668480;visibility:visible;mso-wrap-style:square;mso-width-percent:0;mso-height-percent:200;mso-wrap-distance-left:9pt;mso-wrap-distance-top:3.6pt;mso-wrap-distance-right:9pt;mso-wrap-distance-bottom:3.6pt;mso-position-horizontal:absolute;mso-position-horizontal-relative:page;mso-position-vertical:absolute;mso-position-vertical-relative:text;mso-width-percent:0;mso-height-percent:200;mso-width-relative:margin;mso-height-relative:margin;v-text-anchor:top" o:gfxdata="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" filled="f" stroked="f">
+                <v:textbox style="mso-fit-shape-to-text:t">
+                  <w:txbxContent>
+                    <w:p>
+                      <w:pPr>
+                        <w:rPr>
+                          <w:b/>
+                          <w:bCs/>
+                          <w:color w:val="FFFFFF" w:themeColor="background1"/>
+                          <w:sz w:val="72"/>
+                          <w:szCs w:val="72"/>
+                        </w:rPr>
+                      </w:pPr>
+                      <w:r>
+                        <w:rPr>
+                          <w:b/>
+                          <w:bCs/>
+                          <w:color w:val="FFFFFF" w:themeColor="background1"/>
+                          <w:sz w:val="72"/>
+                          <w:szCs w:val="72"/>
+                        </w:rPr>
+                        <w:t>Sales forecasting</w:t>
+                      </w:r>
+                    </w:p>
+                  </w:txbxContent>
+                </v:textbox>
+                <w10:wrap type="square" anchorx="page"/>
+              </v:shape>
+            </w:pict>
+          </mc:Fallback>
+        </mc:AlternateContent>
+      </w:r>
       <w:r>
         <w:br w:type="page"/>
       </w:r>
@@ -110,8 +1086,17 @@
           <w:b/>
           <w:bCs/>
         </w:rPr>
-        <w:t>Asmaa Ali Abdelaaty</w:t>
-      </w:r>
+        <w:t xml:space="preserve">Asmaa Ali </w:t>
+      </w:r>
+      <w:proofErr w:type="spellStart"/>
+      <w:r>
+        <w:rPr>
+          <w:b/>
+          <w:bCs/>
+        </w:rPr>
+        <w:t>Abdelaaty</w:t>
+      </w:r>
+      <w:proofErr w:type="spellEnd"/>
     </w:p>
     <w:p>
       <w:pPr>
@@ -184,8 +1169,17 @@
           <w:b/>
           <w:bCs/>
         </w:rPr>
-        <w:t>Aml Abdullah shehata</w:t>
-      </w:r>
+        <w:t xml:space="preserve">Aml Abdullah </w:t>
+      </w:r>
+      <w:proofErr w:type="spellStart"/>
+      <w:r>
+        <w:rPr>
+          <w:b/>
+          <w:bCs/>
+        </w:rPr>
+        <w:t>shehata</w:t>
+      </w:r>
+      <w:proofErr w:type="spellEnd"/>
     </w:p>
     <w:p>
       <w:pPr>
@@ -506,7 +1500,43 @@
           <w:szCs w:val="28"/>
           <w:lang w:bidi="ar-EG"/>
         </w:rPr>
-        <w:t>: daily historical records including Sales, Customers, Open, Promo, StateHoliday, SchoolHoliday, Date, Store.</w:t>
+        <w:t xml:space="preserve">: daily historical records including Sales, Customers, Open, Promo, </w:t>
+      </w:r>
+      <w:proofErr w:type="spellStart"/>
+      <w:r>
+        <w:rPr>
+          <w:sz w:val="28"/>
+          <w:szCs w:val="28"/>
+          <w:lang w:bidi="ar-EG"/>
+        </w:rPr>
+        <w:t>StateHoliday</w:t>
+      </w:r>
+      <w:proofErr w:type="spellEnd"/>
+      <w:r>
+        <w:rPr>
+          <w:sz w:val="28"/>
+          <w:szCs w:val="28"/>
+          <w:lang w:bidi="ar-EG"/>
+        </w:rPr>
+        <w:t xml:space="preserve">, </w:t>
+      </w:r>
+      <w:proofErr w:type="spellStart"/>
+      <w:r>
+        <w:rPr>
+          <w:sz w:val="28"/>
+          <w:szCs w:val="28"/>
+          <w:lang w:bidi="ar-EG"/>
+        </w:rPr>
+        <w:t>SchoolHoliday</w:t>
+      </w:r>
+      <w:proofErr w:type="spellEnd"/>
+      <w:r>
+        <w:rPr>
+          <w:sz w:val="28"/>
+          <w:szCs w:val="28"/>
+          <w:lang w:bidi="ar-EG"/>
+        </w:rPr>
+        <w:t>, Date, Store.</w:t>
       </w:r>
     </w:p>
     <w:p>
@@ -568,7 +1598,61 @@
           <w:szCs w:val="28"/>
           <w:lang w:bidi="ar-EG"/>
         </w:rPr>
-        <w:t>: static store info: StoreType, Assortment, CompetitionDistance, CompetitionOpenSinceMonth/Year, Promo2 fields.</w:t>
+        <w:t xml:space="preserve">: static store info: </w:t>
+      </w:r>
+      <w:proofErr w:type="spellStart"/>
+      <w:r>
+        <w:rPr>
+          <w:sz w:val="28"/>
+          <w:szCs w:val="28"/>
+          <w:lang w:bidi="ar-EG"/>
+        </w:rPr>
+        <w:t>StoreType</w:t>
+      </w:r>
+      <w:proofErr w:type="spellEnd"/>
+      <w:r>
+        <w:rPr>
+          <w:sz w:val="28"/>
+          <w:szCs w:val="28"/>
+          <w:lang w:bidi="ar-EG"/>
+        </w:rPr>
+        <w:t xml:space="preserve">, Assortment, </w:t>
+      </w:r>
+      <w:proofErr w:type="spellStart"/>
+      <w:r>
+        <w:rPr>
+          <w:sz w:val="28"/>
+          <w:szCs w:val="28"/>
+          <w:lang w:bidi="ar-EG"/>
+        </w:rPr>
+        <w:t>CompetitionDistance</w:t>
+      </w:r>
+      <w:proofErr w:type="spellEnd"/>
+      <w:r>
+        <w:rPr>
+          <w:sz w:val="28"/>
+          <w:szCs w:val="28"/>
+          <w:lang w:bidi="ar-EG"/>
+        </w:rPr>
+        <w:t xml:space="preserve">, </w:t>
+      </w:r>
+      <w:proofErr w:type="spellStart"/>
+      <w:r>
+        <w:rPr>
+          <w:sz w:val="28"/>
+          <w:szCs w:val="28"/>
+          <w:lang w:bidi="ar-EG"/>
+        </w:rPr>
+        <w:t>CompetitionOpenSinceMonth</w:t>
+      </w:r>
+      <w:proofErr w:type="spellEnd"/>
+      <w:r>
+        <w:rPr>
+          <w:sz w:val="28"/>
+          <w:szCs w:val="28"/>
+          <w:lang w:bidi="ar-EG"/>
+        </w:rPr>
+        <w:t>/Year, Promo2 fields.</w:t>
       </w:r>
     </w:p>
     <w:p>
@@ -634,7 +1718,7 @@
           <w:lang w:bidi="ar-EG"/>
         </w:rPr>
       </w:pPr>
-      <w:hyperlink r:id="rId8" w:history="1">
+      <w:hyperlink r:id="rId9" w:history="1">
         <w:r>
           <w:rPr>
             <w:rStyle w:val="Hyperlink"/>
@@ -786,6 +1870,7 @@
           <w:bCs/>
         </w:rPr>
       </w:pPr>
+      <w:proofErr w:type="spellStart"/>
       <w:r>
         <w:rPr>
           <w:b/>
@@ -793,6 +1878,7 @@
         </w:rPr>
         <w:t>DayOfWeek</w:t>
       </w:r>
+      <w:proofErr w:type="spellEnd"/>
       <w:r>
         <w:rPr>
           <w:b/>
@@ -1070,6 +2156,7 @@
           <w:lang w:bidi="ar-EG"/>
         </w:rPr>
       </w:pPr>
+      <w:proofErr w:type="spellStart"/>
       <w:r>
         <w:rPr>
           <w:b/>
@@ -1078,6 +2165,7 @@
         </w:rPr>
         <w:t>StateHoliday</w:t>
       </w:r>
+      <w:proofErr w:type="spellEnd"/>
       <w:r>
         <w:rPr>
           <w:b/>
@@ -1218,6 +2306,7 @@
           <w:lang w:bidi="ar-EG"/>
         </w:rPr>
       </w:pPr>
+      <w:proofErr w:type="spellStart"/>
       <w:r>
         <w:rPr>
           <w:b/>
@@ -1226,6 +2315,7 @@
         </w:rPr>
         <w:t>SchoolHoliday</w:t>
       </w:r>
+      <w:proofErr w:type="spellEnd"/>
       <w:r>
         <w:rPr>
           <w:b/>
@@ -1374,6 +2464,7 @@
           <w:color w:val="000000" w:themeColor="text1"/>
         </w:rPr>
       </w:pPr>
+      <w:proofErr w:type="spellStart"/>
       <w:r>
         <w:rPr>
           <w:b/>
@@ -1382,6 +2473,7 @@
         </w:rPr>
         <w:t>StoreType</w:t>
       </w:r>
+      <w:proofErr w:type="spellEnd"/>
       <w:r>
         <w:rPr>
           <w:color w:val="000000" w:themeColor="text1"/>
@@ -1496,6 +2588,7 @@
           <w:color w:val="000000" w:themeColor="text1"/>
         </w:rPr>
       </w:pPr>
+      <w:proofErr w:type="spellStart"/>
       <w:r>
         <w:rPr>
           <w:b/>
@@ -1504,6 +2597,7 @@
         </w:rPr>
         <w:t>CompetitionDistance</w:t>
       </w:r>
+      <w:proofErr w:type="spellEnd"/>
       <w:r>
         <w:rPr>
           <w:b/>
@@ -1525,6 +2619,7 @@
           <w:color w:val="000000" w:themeColor="text1"/>
         </w:rPr>
       </w:pPr>
+      <w:proofErr w:type="spellStart"/>
       <w:r>
         <w:rPr>
           <w:b/>
@@ -1533,6 +2628,7 @@
         </w:rPr>
         <w:t>CompetitionOpenSinceMonth</w:t>
       </w:r>
+      <w:proofErr w:type="spellEnd"/>
       <w:r>
         <w:rPr>
           <w:b/>
@@ -1563,6 +2659,7 @@
           <w:color w:val="000000" w:themeColor="text1"/>
         </w:rPr>
       </w:pPr>
+      <w:proofErr w:type="spellStart"/>
       <w:r>
         <w:rPr>
           <w:b/>
@@ -1571,6 +2668,7 @@
         </w:rPr>
         <w:t>CompetitionOpenSinceYear</w:t>
       </w:r>
+      <w:proofErr w:type="spellEnd"/>
       <w:r>
         <w:rPr>
           <w:b/>
@@ -1715,7 +2813,21 @@
         <w:rPr>
           <w:color w:val="000000" w:themeColor="text1"/>
         </w:rPr>
-        <w:t>describes the year and calendar week when the store started participating in Promo2 • DurationPromo2 = CurrentYear - Promo2SinceYear</w:t>
+        <w:t xml:space="preserve">describes the year and calendar week when the store started participating in Promo2 • DurationPromo2 = </w:t>
+      </w:r>
+      <w:proofErr w:type="spellStart"/>
+      <w:r>
+        <w:rPr>
+          <w:color w:val="000000" w:themeColor="text1"/>
+        </w:rPr>
+        <w:t>CurrentYear</w:t>
+      </w:r>
+      <w:proofErr w:type="spellEnd"/>
+      <w:r>
+        <w:rPr>
+          <w:color w:val="000000" w:themeColor="text1"/>
+        </w:rPr>
+        <w:t xml:space="preserve"> - Promo2SinceYear</w:t>
       </w:r>
     </w:p>
     <w:p>
@@ -1725,6 +2837,7 @@
           <w:rtl/>
         </w:rPr>
       </w:pPr>
+      <w:proofErr w:type="spellStart"/>
       <w:r>
         <w:rPr>
           <w:b/>
@@ -1733,6 +2846,7 @@
         </w:rPr>
         <w:t>PromoInterval</w:t>
       </w:r>
+      <w:proofErr w:type="spellEnd"/>
       <w:r>
         <w:rPr>
           <w:b/>
@@ -1769,6 +2883,7 @@
         </w:rPr>
         <w:t>, naming the months the promotion is started anew. E.g. "</w:t>
       </w:r>
+      <w:proofErr w:type="spellStart"/>
       <w:proofErr w:type="gramStart"/>
       <w:r>
         <w:rPr>
@@ -1790,6 +2905,7 @@
         </w:rPr>
         <w:t>Aug,Nov</w:t>
       </w:r>
+      <w:proofErr w:type="spellEnd"/>
       <w:proofErr w:type="gramEnd"/>
       <w:r>
         <w:rPr>
@@ -1835,7 +2951,21 @@
         <w:rPr>
           <w:color w:val="000000" w:themeColor="text1"/>
         </w:rPr>
-        <w:t xml:space="preserve"> the different datasets into a single dataframe to facilitate analysis and modeling.</w:t>
+        <w:t xml:space="preserve"> the different datasets into a single </w:t>
+      </w:r>
+      <w:proofErr w:type="spellStart"/>
+      <w:r>
+        <w:rPr>
+          <w:color w:val="000000" w:themeColor="text1"/>
+        </w:rPr>
+        <w:t>dataframe</w:t>
+      </w:r>
+      <w:proofErr w:type="spellEnd"/>
+      <w:r>
+        <w:rPr>
+          <w:color w:val="000000" w:themeColor="text1"/>
+        </w:rPr>
+        <w:t xml:space="preserve"> to facilitate analysis and modeling.</w:t>
       </w:r>
     </w:p>
     <w:p>
@@ -1979,7 +3109,7 @@
                     </pic:cNvPicPr>
                   </pic:nvPicPr>
                   <pic:blipFill>
-                    <a:blip r:embed="rId9" cstate="print">
+                    <a:blip r:embed="rId10" cstate="print">
                       <a:extLst>
                         <a:ext uri="{28A0092B-C50C-407E-A947-70E740481C1C}">
                           <a14:useLocalDpi xmlns:a14="http://schemas.microsoft.com/office/drawing/2010/main" val="0"/>
@@ -2033,7 +3163,7 @@
                     </pic:cNvPicPr>
                   </pic:nvPicPr>
                   <pic:blipFill>
-                    <a:blip r:embed="rId10" cstate="print">
+                    <a:blip r:embed="rId11" cstate="print">
                       <a:extLst>
                         <a:ext uri="{28A0092B-C50C-407E-A947-70E740481C1C}">
                           <a14:useLocalDpi xmlns:a14="http://schemas.microsoft.com/office/drawing/2010/main" val="0"/>
@@ -2077,7 +3207,7 @@
           <w:color w:val="000000" w:themeColor="text1"/>
         </w:rPr>
         <w:drawing>
-          <wp:inline distT="0" distB="0" distL="0" distR="0" wp14:anchorId="558BDB3A" wp14:editId="506E3F86">
+          <wp:inline distT="0" distB="0" distL="0" distR="0" wp14:anchorId="558BDB3A" wp14:editId="1C03C022">
             <wp:extent cx="5171415" cy="1371600"/>
             <wp:effectExtent l="0" t="0" r="0" b="0"/>
             <wp:docPr id="952661458" name="Picture 3"/>
@@ -2094,7 +3224,7 @@
                     </pic:cNvPicPr>
                   </pic:nvPicPr>
                   <pic:blipFill>
-                    <a:blip r:embed="rId11" cstate="print">
+                    <a:blip r:embed="rId12" cstate="print">
                       <a:extLst>
                         <a:ext uri="{28A0092B-C50C-407E-A947-70E740481C1C}">
                           <a14:useLocalDpi xmlns:a14="http://schemas.microsoft.com/office/drawing/2010/main" val="0"/>
@@ -2340,7 +3470,43 @@
           <w:sz w:val="28"/>
           <w:szCs w:val="28"/>
         </w:rPr>
-        <w:t xml:space="preserve">Customers, Promo, StoreType, Assortment, CompetitionDistance, and time-ba otebook or </w:t>
+        <w:t>Customers, Promo, StoreType, Assortment, CompetitionDistance, and time-</w:t>
+      </w:r>
+      <w:proofErr w:type="spellStart"/>
+      <w:r>
+        <w:rPr>
+          <w:color w:val="0070C0"/>
+          <w:sz w:val="28"/>
+          <w:szCs w:val="28"/>
+        </w:rPr>
+        <w:t>ba</w:t>
+      </w:r>
+      <w:proofErr w:type="spellEnd"/>
+      <w:r>
+        <w:rPr>
+          <w:color w:val="0070C0"/>
+          <w:sz w:val="28"/>
+          <w:szCs w:val="28"/>
+        </w:rPr>
+        <w:t xml:space="preserve"> </w:t>
+      </w:r>
+      <w:proofErr w:type="spellStart"/>
+      <w:r>
+        <w:rPr>
+          <w:color w:val="0070C0"/>
+          <w:sz w:val="28"/>
+          <w:szCs w:val="28"/>
+        </w:rPr>
+        <w:t>otebook</w:t>
+      </w:r>
+      <w:proofErr w:type="spellEnd"/>
+      <w:r>
+        <w:rPr>
+          <w:color w:val="0070C0"/>
+          <w:sz w:val="28"/>
+          <w:szCs w:val="28"/>
+        </w:rPr>
+        <w:t xml:space="preserve"> or </w:t>
       </w:r>
       <w:proofErr w:type="gramStart"/>
       <w:r>
@@ -3071,6 +4237,7 @@
                 <w:szCs w:val="16"/>
               </w:rPr>
             </w:pPr>
+            <w:proofErr w:type="spellStart"/>
             <w:r>
               <w:rPr>
                 <w:b/>
@@ -3080,6 +4247,7 @@
               </w:rPr>
               <w:t>DayOfWeek</w:t>
             </w:r>
+            <w:proofErr w:type="spellEnd"/>
           </w:p>
         </w:tc>
         <w:tc>
@@ -3522,7 +4690,27 @@
                 <w:sz w:val="16"/>
                 <w:szCs w:val="16"/>
               </w:rPr>
-              <w:t>Convert to datetime. Extract features such as year, month, day, weekofyear, and weekday. Useful for time series trend analysis.</w:t>
+              <w:t xml:space="preserve">Convert to datetime. Extract features such as year, month, day, </w:t>
+            </w:r>
+            <w:proofErr w:type="spellStart"/>
+            <w:r>
+              <w:rPr>
+                <w:b/>
+                <w:bCs/>
+                <w:sz w:val="16"/>
+                <w:szCs w:val="16"/>
+              </w:rPr>
+              <w:t>weekofyear</w:t>
+            </w:r>
+            <w:proofErr w:type="spellEnd"/>
+            <w:r>
+              <w:rPr>
+                <w:b/>
+                <w:bCs/>
+                <w:sz w:val="16"/>
+                <w:szCs w:val="16"/>
+              </w:rPr>
+              <w:t>, and weekday. Useful for time series trend analysis.</w:t>
             </w:r>
           </w:p>
         </w:tc>
@@ -4531,6 +5719,7 @@
                 <w:szCs w:val="16"/>
               </w:rPr>
             </w:pPr>
+            <w:proofErr w:type="spellStart"/>
             <w:r>
               <w:rPr>
                 <w:b/>
@@ -4540,6 +5729,7 @@
               </w:rPr>
               <w:t>StateHoliday</w:t>
             </w:r>
+            <w:proofErr w:type="spellEnd"/>
           </w:p>
         </w:tc>
         <w:tc>
@@ -4782,6 +5972,7 @@
                 <w:szCs w:val="16"/>
               </w:rPr>
             </w:pPr>
+            <w:proofErr w:type="spellStart"/>
             <w:r>
               <w:rPr>
                 <w:b/>
@@ -4791,6 +5982,7 @@
               </w:rPr>
               <w:t>SchoolHoliday</w:t>
             </w:r>
+            <w:proofErr w:type="spellEnd"/>
           </w:p>
         </w:tc>
         <w:tc>
@@ -5022,6 +6214,7 @@
                 <w:szCs w:val="16"/>
               </w:rPr>
             </w:pPr>
+            <w:proofErr w:type="spellStart"/>
             <w:r>
               <w:rPr>
                 <w:b/>
@@ -5031,6 +6224,7 @@
               </w:rPr>
               <w:t>StoreType</w:t>
             </w:r>
+            <w:proofErr w:type="spellEnd"/>
           </w:p>
         </w:tc>
         <w:tc>
@@ -5503,6 +6697,7 @@
                 <w:szCs w:val="16"/>
               </w:rPr>
             </w:pPr>
+            <w:proofErr w:type="spellStart"/>
             <w:r>
               <w:rPr>
                 <w:b/>
@@ -5512,6 +6707,7 @@
               </w:rPr>
               <w:t>CompetitionDistance</w:t>
             </w:r>
+            <w:proofErr w:type="spellEnd"/>
           </w:p>
         </w:tc>
         <w:tc>
@@ -5763,6 +6959,7 @@
                 <w:szCs w:val="16"/>
               </w:rPr>
             </w:pPr>
+            <w:proofErr w:type="spellStart"/>
             <w:r>
               <w:rPr>
                 <w:b/>
@@ -5772,6 +6969,7 @@
               </w:rPr>
               <w:t>CompetitionOpenSinceMonth</w:t>
             </w:r>
+            <w:proofErr w:type="spellEnd"/>
           </w:p>
         </w:tc>
         <w:tc>
@@ -5974,7 +7172,27 @@
                 <w:sz w:val="16"/>
                 <w:szCs w:val="16"/>
               </w:rPr>
-              <w:t>Missing = competitor info unknown. Combine with Year to create “competition_open_time” feature.</w:t>
+              <w:t>Missing = competitor info unknown. Combine with Year to create “</w:t>
+            </w:r>
+            <w:proofErr w:type="spellStart"/>
+            <w:r>
+              <w:rPr>
+                <w:b/>
+                <w:bCs/>
+                <w:sz w:val="16"/>
+                <w:szCs w:val="16"/>
+              </w:rPr>
+              <w:t>competition_open_time</w:t>
+            </w:r>
+            <w:proofErr w:type="spellEnd"/>
+            <w:r>
+              <w:rPr>
+                <w:b/>
+                <w:bCs/>
+                <w:sz w:val="16"/>
+                <w:szCs w:val="16"/>
+              </w:rPr>
+              <w:t>” feature.</w:t>
             </w:r>
           </w:p>
         </w:tc>
@@ -6003,6 +7221,7 @@
                 <w:szCs w:val="16"/>
               </w:rPr>
             </w:pPr>
+            <w:proofErr w:type="spellStart"/>
             <w:r>
               <w:rPr>
                 <w:b/>
@@ -6012,6 +7231,7 @@
               </w:rPr>
               <w:t>CompetitionOpenSinceYear</w:t>
             </w:r>
+            <w:proofErr w:type="spellEnd"/>
           </w:p>
         </w:tc>
         <w:tc>
@@ -6454,7 +7674,27 @@
                 <w:sz w:val="16"/>
                 <w:szCs w:val="16"/>
               </w:rPr>
-              <w:t>Check how ongoing promotions affect sales. Combine with PromoInterval to detect active months.</w:t>
+              <w:t>Check how ongoing promotions affect sales. Combine with </w:t>
+            </w:r>
+            <w:proofErr w:type="spellStart"/>
+            <w:r>
+              <w:rPr>
+                <w:b/>
+                <w:bCs/>
+                <w:sz w:val="16"/>
+                <w:szCs w:val="16"/>
+              </w:rPr>
+              <w:t>PromoInterval</w:t>
+            </w:r>
+            <w:proofErr w:type="spellEnd"/>
+            <w:r>
+              <w:rPr>
+                <w:b/>
+                <w:bCs/>
+                <w:sz w:val="16"/>
+                <w:szCs w:val="16"/>
+              </w:rPr>
+              <w:t> to detect active months.</w:t>
             </w:r>
           </w:p>
         </w:tc>
@@ -6983,6 +8223,7 @@
                 <w:szCs w:val="16"/>
               </w:rPr>
             </w:pPr>
+            <w:proofErr w:type="spellStart"/>
             <w:r>
               <w:rPr>
                 <w:b/>
@@ -6992,6 +8233,7 @@
               </w:rPr>
               <w:t>PromoInterval</w:t>
             </w:r>
+            <w:proofErr w:type="spellEnd"/>
           </w:p>
         </w:tc>
         <w:tc>
@@ -7026,6 +8268,7 @@
               </w:rPr>
               <w:t>Months when Promo2 is repeated (e.g., “</w:t>
             </w:r>
+            <w:proofErr w:type="spellStart"/>
             <w:proofErr w:type="gramStart"/>
             <w:r>
               <w:rPr>
@@ -7056,6 +8299,7 @@
               </w:rPr>
               <w:t>Jul,Oct</w:t>
             </w:r>
+            <w:proofErr w:type="spellEnd"/>
             <w:proofErr w:type="gramEnd"/>
             <w:r>
               <w:rPr>
@@ -7134,6 +8378,7 @@
               </w:rPr>
               <w:t>“</w:t>
             </w:r>
+            <w:proofErr w:type="spellStart"/>
             <w:proofErr w:type="gramStart"/>
             <w:r>
               <w:rPr>
@@ -7164,6 +8409,7 @@
               </w:rPr>
               <w:t>Jul,Oct</w:t>
             </w:r>
+            <w:proofErr w:type="spellEnd"/>
             <w:proofErr w:type="gramEnd"/>
             <w:r>
               <w:rPr>
@@ -7436,6 +8682,7 @@
                 <w:szCs w:val="20"/>
               </w:rPr>
             </w:pPr>
+            <w:proofErr w:type="spellStart"/>
             <w:r>
               <w:rPr>
                 <w:b/>
@@ -7446,6 +8693,7 @@
               </w:rPr>
               <w:t>dtype</w:t>
             </w:r>
+            <w:proofErr w:type="spellEnd"/>
           </w:p>
         </w:tc>
         <w:tc>
@@ -7621,6 +8869,7 @@
                 <w:szCs w:val="20"/>
               </w:rPr>
             </w:pPr>
+            <w:proofErr w:type="spellStart"/>
             <w:r>
               <w:rPr>
                 <w:b/>
@@ -7631,6 +8880,7 @@
               </w:rPr>
               <w:t>DayOfWeek</w:t>
             </w:r>
+            <w:proofErr w:type="spellEnd"/>
             <w:r>
               <w:rPr>
                 <w:b/>
@@ -8243,6 +9493,7 @@
                 <w:szCs w:val="20"/>
               </w:rPr>
             </w:pPr>
+            <w:proofErr w:type="spellStart"/>
             <w:r>
               <w:rPr>
                 <w:b/>
@@ -8251,7 +9502,18 @@
                 <w:sz w:val="20"/>
                 <w:szCs w:val="20"/>
               </w:rPr>
-              <w:t xml:space="preserve">StateHoliday               </w:t>
+              <w:t>StateHoliday</w:t>
+            </w:r>
+            <w:proofErr w:type="spellEnd"/>
+            <w:r>
+              <w:rPr>
+                <w:b/>
+                <w:bCs/>
+                <w:color w:val="000000" w:themeColor="text1"/>
+                <w:sz w:val="20"/>
+                <w:szCs w:val="20"/>
+              </w:rPr>
+              <w:t xml:space="preserve">               </w:t>
             </w:r>
           </w:p>
         </w:tc>
@@ -8347,6 +9609,7 @@
                 <w:szCs w:val="20"/>
               </w:rPr>
             </w:pPr>
+            <w:proofErr w:type="spellStart"/>
             <w:r>
               <w:rPr>
                 <w:b/>
@@ -8355,7 +9618,18 @@
                 <w:sz w:val="20"/>
                 <w:szCs w:val="20"/>
               </w:rPr>
-              <w:t xml:space="preserve">SchoolHoliday      </w:t>
+              <w:t>SchoolHoliday</w:t>
+            </w:r>
+            <w:proofErr w:type="spellEnd"/>
+            <w:r>
+              <w:rPr>
+                <w:b/>
+                <w:bCs/>
+                <w:color w:val="000000" w:themeColor="text1"/>
+                <w:sz w:val="20"/>
+                <w:szCs w:val="20"/>
+              </w:rPr>
+              <w:t xml:space="preserve">      </w:t>
             </w:r>
           </w:p>
         </w:tc>
@@ -8448,6 +9722,7 @@
                 <w:szCs w:val="20"/>
               </w:rPr>
             </w:pPr>
+            <w:proofErr w:type="spellStart"/>
             <w:r>
               <w:rPr>
                 <w:b/>
@@ -8456,7 +9731,18 @@
                 <w:sz w:val="20"/>
                 <w:szCs w:val="20"/>
               </w:rPr>
-              <w:t xml:space="preserve">StoreType                  </w:t>
+              <w:t>StoreType</w:t>
+            </w:r>
+            <w:proofErr w:type="spellEnd"/>
+            <w:r>
+              <w:rPr>
+                <w:b/>
+                <w:bCs/>
+                <w:color w:val="000000" w:themeColor="text1"/>
+                <w:sz w:val="20"/>
+                <w:szCs w:val="20"/>
+              </w:rPr>
+              <w:t xml:space="preserve">                  </w:t>
             </w:r>
           </w:p>
         </w:tc>
@@ -8650,6 +9936,7 @@
                 <w:szCs w:val="20"/>
               </w:rPr>
             </w:pPr>
+            <w:proofErr w:type="spellStart"/>
             <w:r>
               <w:rPr>
                 <w:b/>
@@ -8658,7 +9945,18 @@
                 <w:sz w:val="20"/>
                 <w:szCs w:val="20"/>
               </w:rPr>
-              <w:t xml:space="preserve">CompetitionDistance        </w:t>
+              <w:t>CompetitionDistance</w:t>
+            </w:r>
+            <w:proofErr w:type="spellEnd"/>
+            <w:r>
+              <w:rPr>
+                <w:b/>
+                <w:bCs/>
+                <w:color w:val="000000" w:themeColor="text1"/>
+                <w:sz w:val="20"/>
+                <w:szCs w:val="20"/>
+              </w:rPr>
+              <w:t xml:space="preserve">        </w:t>
             </w:r>
           </w:p>
         </w:tc>
@@ -8751,6 +10049,7 @@
                 <w:szCs w:val="20"/>
               </w:rPr>
             </w:pPr>
+            <w:proofErr w:type="spellStart"/>
             <w:r>
               <w:rPr>
                 <w:b/>
@@ -8759,7 +10058,18 @@
                 <w:sz w:val="20"/>
                 <w:szCs w:val="20"/>
               </w:rPr>
-              <w:t xml:space="preserve">CompetitionOpenSinceMonth  </w:t>
+              <w:t>CompetitionOpenSinceMonth</w:t>
+            </w:r>
+            <w:proofErr w:type="spellEnd"/>
+            <w:r>
+              <w:rPr>
+                <w:b/>
+                <w:bCs/>
+                <w:color w:val="000000" w:themeColor="text1"/>
+                <w:sz w:val="20"/>
+                <w:szCs w:val="20"/>
+              </w:rPr>
+              <w:t xml:space="preserve">  </w:t>
             </w:r>
           </w:p>
         </w:tc>
@@ -8852,6 +10162,7 @@
                 <w:szCs w:val="20"/>
               </w:rPr>
             </w:pPr>
+            <w:proofErr w:type="spellStart"/>
             <w:r>
               <w:rPr>
                 <w:b/>
@@ -8860,7 +10171,18 @@
                 <w:sz w:val="20"/>
                 <w:szCs w:val="20"/>
               </w:rPr>
-              <w:t xml:space="preserve">CompetitionOpenSinceYear   </w:t>
+              <w:t>CompetitionOpenSinceYear</w:t>
+            </w:r>
+            <w:proofErr w:type="spellEnd"/>
+            <w:r>
+              <w:rPr>
+                <w:b/>
+                <w:bCs/>
+                <w:color w:val="000000" w:themeColor="text1"/>
+                <w:sz w:val="20"/>
+                <w:szCs w:val="20"/>
+              </w:rPr>
+              <w:t xml:space="preserve">   </w:t>
             </w:r>
           </w:p>
         </w:tc>
@@ -9259,6 +10581,7 @@
                 <w:szCs w:val="20"/>
               </w:rPr>
             </w:pPr>
+            <w:proofErr w:type="spellStart"/>
             <w:r>
               <w:rPr>
                 <w:b/>
@@ -9267,7 +10590,18 @@
                 <w:sz w:val="20"/>
                 <w:szCs w:val="20"/>
               </w:rPr>
-              <w:t xml:space="preserve">PromoInterval  </w:t>
+              <w:t>PromoInterval</w:t>
+            </w:r>
+            <w:proofErr w:type="spellEnd"/>
+            <w:r>
+              <w:rPr>
+                <w:b/>
+                <w:bCs/>
+                <w:color w:val="000000" w:themeColor="text1"/>
+                <w:sz w:val="20"/>
+                <w:szCs w:val="20"/>
+              </w:rPr>
+              <w:t xml:space="preserve">  </w:t>
             </w:r>
           </w:p>
         </w:tc>
@@ -9428,7 +10762,7 @@
                     </pic:cNvPicPr>
                   </pic:nvPicPr>
                   <pic:blipFill>
-                    <a:blip r:embed="rId12">
+                    <a:blip r:embed="rId13">
                       <a:extLst>
                         <a:ext uri="{28A0092B-C50C-407E-A947-70E740481C1C}">
                           <a14:useLocalDpi xmlns:a14="http://schemas.microsoft.com/office/drawing/2010/main" val="0"/>
@@ -9500,7 +10834,29 @@
           <w:sz w:val="22"/>
           <w:szCs w:val="22"/>
         </w:rPr>
-        <w:t xml:space="preserve"> most features affect on the target (Sales) are</w:t>
+        <w:t xml:space="preserve"> most features </w:t>
+      </w:r>
+      <w:proofErr w:type="spellStart"/>
+      <w:r>
+        <w:rPr>
+          <w:b/>
+          <w:bCs/>
+          <w:color w:val="000000" w:themeColor="text1"/>
+          <w:sz w:val="22"/>
+          <w:szCs w:val="22"/>
+        </w:rPr>
+        <w:t>affect</w:t>
+      </w:r>
+      <w:proofErr w:type="spellEnd"/>
+      <w:r>
+        <w:rPr>
+          <w:b/>
+          <w:bCs/>
+          <w:color w:val="000000" w:themeColor="text1"/>
+          <w:sz w:val="22"/>
+          <w:szCs w:val="22"/>
+        </w:rPr>
+        <w:t xml:space="preserve"> on the target (Sales) are</w:t>
       </w:r>
     </w:p>
     <w:p>
@@ -9549,7 +10905,7 @@
                     <pic:cNvPicPr/>
                   </pic:nvPicPr>
                   <pic:blipFill>
-                    <a:blip r:embed="rId13">
+                    <a:blip r:embed="rId14">
                       <a:extLst>
                         <a:ext uri="{28A0092B-C50C-407E-A947-70E740481C1C}">
                           <a14:useLocalDpi xmlns:a14="http://schemas.microsoft.com/office/drawing/2010/main" val="0"/>
@@ -9625,13 +10981,23 @@
           <w:szCs w:val="22"/>
         </w:rPr>
       </w:pPr>
+      <w:proofErr w:type="spellStart"/>
       <w:r>
         <w:rPr>
           <w:color w:val="000000" w:themeColor="text1"/>
           <w:sz w:val="22"/>
           <w:szCs w:val="22"/>
         </w:rPr>
-        <w:t>DayOfWeek (0.46)</w:t>
+        <w:t>DayOfWeek</w:t>
+      </w:r>
+      <w:proofErr w:type="spellEnd"/>
+      <w:r>
+        <w:rPr>
+          <w:color w:val="000000" w:themeColor="text1"/>
+          <w:sz w:val="22"/>
+          <w:szCs w:val="22"/>
+        </w:rPr>
+        <w:t xml:space="preserve"> (0.46)</w:t>
       </w:r>
     </w:p>
     <w:p>
@@ -9785,13 +11151,23 @@
                 <w:szCs w:val="20"/>
               </w:rPr>
             </w:pPr>
+            <w:proofErr w:type="spellStart"/>
             <w:r>
               <w:rPr>
                 <w:color w:val="000000" w:themeColor="text1"/>
                 <w:sz w:val="20"/>
                 <w:szCs w:val="20"/>
               </w:rPr>
-              <w:t xml:space="preserve">CompetitionDistance        </w:t>
+              <w:t>CompetitionDistance</w:t>
+            </w:r>
+            <w:proofErr w:type="spellEnd"/>
+            <w:r>
+              <w:rPr>
+                <w:color w:val="000000" w:themeColor="text1"/>
+                <w:sz w:val="20"/>
+                <w:szCs w:val="20"/>
+              </w:rPr>
+              <w:t xml:space="preserve">        </w:t>
             </w:r>
           </w:p>
         </w:tc>
@@ -9834,13 +11210,23 @@
                 <w:szCs w:val="20"/>
               </w:rPr>
             </w:pPr>
+            <w:proofErr w:type="spellStart"/>
             <w:r>
               <w:rPr>
                 <w:color w:val="000000" w:themeColor="text1"/>
                 <w:sz w:val="20"/>
                 <w:szCs w:val="20"/>
               </w:rPr>
-              <w:t xml:space="preserve">CompetitionOpenSinceMonth  </w:t>
+              <w:t>CompetitionOpenSinceMonth</w:t>
+            </w:r>
+            <w:proofErr w:type="spellEnd"/>
+            <w:r>
+              <w:rPr>
+                <w:color w:val="000000" w:themeColor="text1"/>
+                <w:sz w:val="20"/>
+                <w:szCs w:val="20"/>
+              </w:rPr>
+              <w:t xml:space="preserve">  </w:t>
             </w:r>
           </w:p>
         </w:tc>
@@ -9883,13 +11269,23 @@
                 <w:szCs w:val="20"/>
               </w:rPr>
             </w:pPr>
+            <w:proofErr w:type="spellStart"/>
             <w:r>
               <w:rPr>
                 <w:color w:val="000000" w:themeColor="text1"/>
                 <w:sz w:val="20"/>
                 <w:szCs w:val="20"/>
               </w:rPr>
-              <w:t xml:space="preserve">CompetitionOpenSinceYear   </w:t>
+              <w:t>CompetitionOpenSinceYear</w:t>
+            </w:r>
+            <w:proofErr w:type="spellEnd"/>
+            <w:r>
+              <w:rPr>
+                <w:color w:val="000000" w:themeColor="text1"/>
+                <w:sz w:val="20"/>
+                <w:szCs w:val="20"/>
+              </w:rPr>
+              <w:t xml:space="preserve">   </w:t>
             </w:r>
           </w:p>
         </w:tc>
@@ -10030,13 +11426,23 @@
                 <w:szCs w:val="20"/>
               </w:rPr>
             </w:pPr>
+            <w:proofErr w:type="spellStart"/>
             <w:r>
               <w:rPr>
                 <w:color w:val="000000" w:themeColor="text1"/>
                 <w:sz w:val="20"/>
                 <w:szCs w:val="20"/>
               </w:rPr>
-              <w:t xml:space="preserve">PromoInterval  </w:t>
+              <w:t>PromoInterval</w:t>
+            </w:r>
+            <w:proofErr w:type="spellEnd"/>
+            <w:r>
+              <w:rPr>
+                <w:color w:val="000000" w:themeColor="text1"/>
+                <w:sz w:val="20"/>
+                <w:szCs w:val="20"/>
+              </w:rPr>
+              <w:t xml:space="preserve">  </w:t>
             </w:r>
           </w:p>
         </w:tc>
@@ -10137,7 +11543,7 @@
                     <pic:cNvPicPr/>
                   </pic:nvPicPr>
                   <pic:blipFill>
-                    <a:blip r:embed="rId14"/>
+                    <a:blip r:embed="rId15"/>
                     <a:stretch>
                       <a:fillRect/>
                     </a:stretch>
@@ -10206,7 +11612,7 @@
                     <pic:cNvPicPr/>
                   </pic:nvPicPr>
                   <pic:blipFill>
-                    <a:blip r:embed="rId15"/>
+                    <a:blip r:embed="rId16"/>
                     <a:stretch>
                       <a:fillRect/>
                     </a:stretch>
@@ -10251,7 +11657,7 @@
                     <pic:cNvPicPr/>
                   </pic:nvPicPr>
                   <pic:blipFill>
-                    <a:blip r:embed="rId16"/>
+                    <a:blip r:embed="rId17"/>
                     <a:stretch>
                       <a:fillRect/>
                     </a:stretch>
@@ -10485,6 +11891,7 @@
                 <w:szCs w:val="28"/>
               </w:rPr>
             </w:pPr>
+            <w:proofErr w:type="spellStart"/>
             <w:r>
               <w:rPr>
                 <w:color w:val="0070C0"/>
@@ -10493,6 +11900,7 @@
               </w:rPr>
               <w:t>DayOfWeek</w:t>
             </w:r>
+            <w:proofErr w:type="spellEnd"/>
           </w:p>
         </w:tc>
         <w:tc>
@@ -10855,6 +12263,7 @@
                 <w:szCs w:val="28"/>
               </w:rPr>
             </w:pPr>
+            <w:proofErr w:type="spellStart"/>
             <w:r>
               <w:rPr>
                 <w:color w:val="0070C0"/>
@@ -10863,6 +12272,7 @@
               </w:rPr>
               <w:t>SchoolHoliday</w:t>
             </w:r>
+            <w:proofErr w:type="spellEnd"/>
           </w:p>
         </w:tc>
         <w:tc>
@@ -10929,6 +12339,7 @@
                 <w:szCs w:val="28"/>
               </w:rPr>
             </w:pPr>
+            <w:proofErr w:type="spellStart"/>
             <w:r>
               <w:rPr>
                 <w:color w:val="0070C0"/>
@@ -10937,6 +12348,7 @@
               </w:rPr>
               <w:t>CompetitionDistance</w:t>
             </w:r>
+            <w:proofErr w:type="spellEnd"/>
           </w:p>
         </w:tc>
         <w:tc>
@@ -11003,6 +12415,7 @@
                 <w:szCs w:val="28"/>
               </w:rPr>
             </w:pPr>
+            <w:proofErr w:type="spellStart"/>
             <w:r>
               <w:rPr>
                 <w:color w:val="0070C0"/>
@@ -11011,6 +12424,7 @@
               </w:rPr>
               <w:t>CompetitionOpenSinceMonth</w:t>
             </w:r>
+            <w:proofErr w:type="spellEnd"/>
           </w:p>
         </w:tc>
         <w:tc>
@@ -11077,6 +12491,7 @@
                 <w:szCs w:val="28"/>
               </w:rPr>
             </w:pPr>
+            <w:proofErr w:type="spellStart"/>
             <w:r>
               <w:rPr>
                 <w:color w:val="0070C0"/>
@@ -11085,6 +12500,7 @@
               </w:rPr>
               <w:t>CompetitionOpenSinceYear</w:t>
             </w:r>
+            <w:proofErr w:type="spellEnd"/>
           </w:p>
         </w:tc>
         <w:tc>
@@ -11510,6 +12926,7 @@
                 <w:szCs w:val="20"/>
               </w:rPr>
             </w:pPr>
+            <w:proofErr w:type="spellStart"/>
             <w:r>
               <w:rPr>
                 <w:b/>
@@ -11520,6 +12937,7 @@
               </w:rPr>
               <w:t>dtype</w:t>
             </w:r>
+            <w:proofErr w:type="spellEnd"/>
           </w:p>
         </w:tc>
       </w:tr>
@@ -11640,6 +13058,7 @@
                 <w:szCs w:val="20"/>
               </w:rPr>
             </w:pPr>
+            <w:proofErr w:type="spellStart"/>
             <w:r>
               <w:rPr>
                 <w:b/>
@@ -11648,7 +13067,18 @@
                 <w:sz w:val="20"/>
                 <w:szCs w:val="20"/>
               </w:rPr>
-              <w:t xml:space="preserve">StateHoliday               </w:t>
+              <w:t>StateHoliday</w:t>
+            </w:r>
+            <w:proofErr w:type="spellEnd"/>
+            <w:r>
+              <w:rPr>
+                <w:b/>
+                <w:bCs/>
+                <w:color w:val="000000" w:themeColor="text1"/>
+                <w:sz w:val="20"/>
+                <w:szCs w:val="20"/>
+              </w:rPr>
+              <w:t xml:space="preserve">               </w:t>
             </w:r>
           </w:p>
         </w:tc>
@@ -11718,6 +13148,7 @@
                 <w:szCs w:val="20"/>
               </w:rPr>
             </w:pPr>
+            <w:proofErr w:type="spellStart"/>
             <w:r>
               <w:rPr>
                 <w:b/>
@@ -11726,7 +13157,18 @@
                 <w:sz w:val="20"/>
                 <w:szCs w:val="20"/>
               </w:rPr>
-              <w:t xml:space="preserve">SchoolHoliday      </w:t>
+              <w:t>SchoolHoliday</w:t>
+            </w:r>
+            <w:proofErr w:type="spellEnd"/>
+            <w:r>
+              <w:rPr>
+                <w:b/>
+                <w:bCs/>
+                <w:color w:val="000000" w:themeColor="text1"/>
+                <w:sz w:val="20"/>
+                <w:szCs w:val="20"/>
+              </w:rPr>
+              <w:t xml:space="preserve">      </w:t>
             </w:r>
           </w:p>
         </w:tc>
@@ -11796,6 +13238,7 @@
                 <w:szCs w:val="20"/>
               </w:rPr>
             </w:pPr>
+            <w:proofErr w:type="spellStart"/>
             <w:r>
               <w:rPr>
                 <w:b/>
@@ -11804,7 +13247,18 @@
                 <w:sz w:val="20"/>
                 <w:szCs w:val="20"/>
               </w:rPr>
-              <w:t xml:space="preserve">StoreType                  </w:t>
+              <w:t>StoreType</w:t>
+            </w:r>
+            <w:proofErr w:type="spellEnd"/>
+            <w:r>
+              <w:rPr>
+                <w:b/>
+                <w:bCs/>
+                <w:color w:val="000000" w:themeColor="text1"/>
+                <w:sz w:val="20"/>
+                <w:szCs w:val="20"/>
+              </w:rPr>
+              <w:t xml:space="preserve">                  </w:t>
             </w:r>
           </w:p>
         </w:tc>
@@ -11952,6 +13406,7 @@
                 <w:szCs w:val="20"/>
               </w:rPr>
             </w:pPr>
+            <w:proofErr w:type="spellStart"/>
             <w:r>
               <w:rPr>
                 <w:b/>
@@ -11960,7 +13415,18 @@
                 <w:sz w:val="20"/>
                 <w:szCs w:val="20"/>
               </w:rPr>
-              <w:t xml:space="preserve">PromoInterval </w:t>
+              <w:t>PromoInterval</w:t>
+            </w:r>
+            <w:proofErr w:type="spellEnd"/>
+            <w:r>
+              <w:rPr>
+                <w:b/>
+                <w:bCs/>
+                <w:color w:val="000000" w:themeColor="text1"/>
+                <w:sz w:val="20"/>
+                <w:szCs w:val="20"/>
+              </w:rPr>
+              <w:t xml:space="preserve"> </w:t>
             </w:r>
           </w:p>
         </w:tc>
@@ -12828,6 +14294,7 @@
                 <w:szCs w:val="18"/>
               </w:rPr>
             </w:pPr>
+            <w:proofErr w:type="spellStart"/>
             <w:r>
               <w:rPr>
                 <w:b/>
@@ -12838,6 +14305,7 @@
               </w:rPr>
               <w:t>DayOfWeek</w:t>
             </w:r>
+            <w:proofErr w:type="spellEnd"/>
           </w:p>
         </w:tc>
         <w:tc>
@@ -13943,6 +15411,7 @@
                 <w:szCs w:val="18"/>
               </w:rPr>
             </w:pPr>
+            <w:proofErr w:type="spellStart"/>
             <w:r>
               <w:rPr>
                 <w:b/>
@@ -13953,6 +15422,7 @@
               </w:rPr>
               <w:t>SchoolHoliday</w:t>
             </w:r>
+            <w:proofErr w:type="spellEnd"/>
           </w:p>
         </w:tc>
         <w:tc>
@@ -14166,6 +15636,7 @@
                 <w:szCs w:val="18"/>
               </w:rPr>
             </w:pPr>
+            <w:proofErr w:type="spellStart"/>
             <w:r>
               <w:rPr>
                 <w:b/>
@@ -14176,6 +15647,7 @@
               </w:rPr>
               <w:t>CompetitionDistance</w:t>
             </w:r>
+            <w:proofErr w:type="spellEnd"/>
           </w:p>
         </w:tc>
         <w:tc>
@@ -14389,6 +15861,7 @@
                 <w:szCs w:val="18"/>
               </w:rPr>
             </w:pPr>
+            <w:proofErr w:type="spellStart"/>
             <w:r>
               <w:rPr>
                 <w:b/>
@@ -14399,6 +15872,7 @@
               </w:rPr>
               <w:t>CompetitionOpenSinceMonth</w:t>
             </w:r>
+            <w:proofErr w:type="spellEnd"/>
           </w:p>
         </w:tc>
         <w:tc>
@@ -14612,6 +16086,7 @@
                 <w:szCs w:val="18"/>
               </w:rPr>
             </w:pPr>
+            <w:proofErr w:type="spellStart"/>
             <w:r>
               <w:rPr>
                 <w:b/>
@@ -14622,6 +16097,7 @@
               </w:rPr>
               <w:t>CompetitionOpenSinceYear</w:t>
             </w:r>
+            <w:proofErr w:type="spellEnd"/>
           </w:p>
         </w:tc>
         <w:tc>
@@ -15663,6 +17139,7 @@
                 <w:szCs w:val="28"/>
               </w:rPr>
             </w:pPr>
+            <w:proofErr w:type="spellStart"/>
             <w:r>
               <w:rPr>
                 <w:b/>
@@ -15673,6 +17150,7 @@
               </w:rPr>
               <w:t>freq</w:t>
             </w:r>
+            <w:proofErr w:type="spellEnd"/>
           </w:p>
         </w:tc>
       </w:tr>
@@ -15823,6 +17301,7 @@
                 <w:szCs w:val="28"/>
               </w:rPr>
             </w:pPr>
+            <w:proofErr w:type="spellStart"/>
             <w:r>
               <w:rPr>
                 <w:b/>
@@ -15833,6 +17312,7 @@
               </w:rPr>
               <w:t>StateHoliday</w:t>
             </w:r>
+            <w:proofErr w:type="spellEnd"/>
           </w:p>
         </w:tc>
         <w:tc>
@@ -15950,6 +17430,7 @@
                 <w:szCs w:val="28"/>
               </w:rPr>
             </w:pPr>
+            <w:proofErr w:type="spellStart"/>
             <w:r>
               <w:rPr>
                 <w:b/>
@@ -15960,6 +17441,7 @@
               </w:rPr>
               <w:t>StoreType</w:t>
             </w:r>
+            <w:proofErr w:type="spellEnd"/>
           </w:p>
         </w:tc>
         <w:tc>
@@ -16204,6 +17686,7 @@
                 <w:szCs w:val="28"/>
               </w:rPr>
             </w:pPr>
+            <w:proofErr w:type="spellStart"/>
             <w:r>
               <w:rPr>
                 <w:b/>
@@ -16214,6 +17697,7 @@
               </w:rPr>
               <w:t>PromoInterval</w:t>
             </w:r>
+            <w:proofErr w:type="spellEnd"/>
           </w:p>
         </w:tc>
         <w:tc>
@@ -16278,6 +17762,7 @@
                 <w:szCs w:val="28"/>
               </w:rPr>
             </w:pPr>
+            <w:proofErr w:type="spellStart"/>
             <w:proofErr w:type="gramStart"/>
             <w:r>
               <w:rPr>
@@ -16305,6 +17790,7 @@
               </w:rPr>
               <w:t>Jul,Oct</w:t>
             </w:r>
+            <w:proofErr w:type="spellEnd"/>
             <w:proofErr w:type="gramEnd"/>
           </w:p>
         </w:tc>
@@ -16444,7 +17930,7 @@
                 <w:szCs w:val="28"/>
               </w:rPr>
               <w:drawing>
-                <wp:anchor distT="0" distB="0" distL="114300" distR="114300" simplePos="0" relativeHeight="251663360" behindDoc="0" locked="0" layoutInCell="1" allowOverlap="1" wp14:anchorId="72F50731" wp14:editId="5CCD3562">
+                <wp:anchor distT="0" distB="0" distL="114300" distR="114300" simplePos="0" relativeHeight="251663360" behindDoc="0" locked="0" layoutInCell="1" allowOverlap="1" wp14:anchorId="72F50731" wp14:editId="53DE8E3E">
                   <wp:simplePos x="0" y="0"/>
                   <wp:positionH relativeFrom="column">
                     <wp:posOffset>-1030201</wp:posOffset>
@@ -16467,7 +17953,7 @@
                           <pic:cNvPicPr/>
                         </pic:nvPicPr>
                         <pic:blipFill>
-                          <a:blip r:embed="rId17" cstate="print">
+                          <a:blip r:embed="rId18" cstate="print">
                             <a:extLst>
                               <a:ext uri="{28A0092B-C50C-407E-A947-70E740481C1C}">
                                 <a14:useLocalDpi xmlns:a14="http://schemas.microsoft.com/office/drawing/2010/main" val="0"/>
@@ -16804,7 +18290,7 @@
                           <pic:cNvPicPr/>
                         </pic:nvPicPr>
                         <pic:blipFill>
-                          <a:blip r:embed="rId18" cstate="print">
+                          <a:blip r:embed="rId19" cstate="print">
                             <a:extLst>
                               <a:ext uri="{28A0092B-C50C-407E-A947-70E740481C1C}">
                                 <a14:useLocalDpi xmlns:a14="http://schemas.microsoft.com/office/drawing/2010/main" val="0"/>
@@ -17048,7 +18534,7 @@
                     <pic:cNvPicPr/>
                   </pic:nvPicPr>
                   <pic:blipFill>
-                    <a:blip r:embed="rId19" cstate="print">
+                    <a:blip r:embed="rId20" cstate="print">
                       <a:extLst>
                         <a:ext uri="{28A0092B-C50C-407E-A947-70E740481C1C}">
                           <a14:useLocalDpi xmlns:a14="http://schemas.microsoft.com/office/drawing/2010/main" val="0"/>
@@ -17417,7 +18903,7 @@
                           <pic:cNvPicPr/>
                         </pic:nvPicPr>
                         <pic:blipFill>
-                          <a:blip r:embed="rId20">
+                          <a:blip r:embed="rId21">
                             <a:extLst>
                               <a:ext uri="{28A0092B-C50C-407E-A947-70E740481C1C}">
                                 <a14:useLocalDpi xmlns:a14="http://schemas.microsoft.com/office/drawing/2010/main" val="0"/>
@@ -17557,7 +19043,7 @@
           <w:szCs w:val="28"/>
         </w:rPr>
         <w:drawing>
-          <wp:anchor distT="0" distB="0" distL="114300" distR="114300" simplePos="0" relativeHeight="251666432" behindDoc="0" locked="0" layoutInCell="1" allowOverlap="1" wp14:anchorId="65F38177" wp14:editId="78D59481">
+          <wp:anchor distT="0" distB="0" distL="114300" distR="114300" simplePos="0" relativeHeight="251666432" behindDoc="0" locked="0" layoutInCell="1" allowOverlap="1" wp14:anchorId="65F38177" wp14:editId="0C17A3A9">
             <wp:simplePos x="0" y="0"/>
             <wp:positionH relativeFrom="page">
               <wp:posOffset>588191</wp:posOffset>
@@ -17580,7 +19066,7 @@
                     <pic:cNvPicPr/>
                   </pic:nvPicPr>
                   <pic:blipFill>
-                    <a:blip r:embed="rId21">
+                    <a:blip r:embed="rId22">
                       <a:extLst>
                         <a:ext uri="{28A0092B-C50C-407E-A947-70E740481C1C}">
                           <a14:useLocalDpi xmlns:a14="http://schemas.microsoft.com/office/drawing/2010/main" val="0"/>
@@ -18499,6 +19985,119 @@
     </w:lvl>
   </w:abstractNum>
   <w:abstractNum w:abstractNumId="5" w15:restartNumberingAfterBreak="0">
+    <w:nsid w:val="27133112"/>
+    <w:multiLevelType w:val="hybridMultilevel"/>
+    <w:tmpl w:val="5390358A"/>
+    <w:lvl w:ilvl="0" w:tplc="04090005">
+      <w:start w:val="1"/>
+      <w:numFmt w:val="bullet"/>
+      <w:lvlText w:val=""/>
+      <w:lvlJc w:val="left"/>
+      <w:pPr>
+        <w:ind w:left="1440" w:hanging="360"/>
+      </w:pPr>
+      <w:rPr>
+        <w:rFonts w:ascii="Wingdings" w:hAnsi="Wingdings" w:hint="default"/>
+      </w:rPr>
+    </w:lvl>
+    <w:lvl w:ilvl="1" w:tplc="04090003" w:tentative="1">
+      <w:start w:val="1"/>
+      <w:numFmt w:val="bullet"/>
+      <w:lvlText w:val="o"/>
+      <w:lvlJc w:val="left"/>
+      <w:pPr>
+        <w:ind w:left="2160" w:hanging="360"/>
+      </w:pPr>
+      <w:rPr>
+        <w:rFonts w:ascii="Courier New" w:hAnsi="Courier New" w:cs="Courier New" w:hint="default"/>
+      </w:rPr>
+    </w:lvl>
+    <w:lvl w:ilvl="2" w:tplc="04090005" w:tentative="1">
+      <w:start w:val="1"/>
+      <w:numFmt w:val="bullet"/>
+      <w:lvlText w:val=""/>
+      <w:lvlJc w:val="left"/>
+      <w:pPr>
+        <w:ind w:left="2880" w:hanging="360"/>
+      </w:pPr>
+      <w:rPr>
+        <w:rFonts w:ascii="Wingdings" w:hAnsi="Wingdings" w:hint="default"/>
+      </w:rPr>
+    </w:lvl>
+    <w:lvl w:ilvl="3" w:tplc="04090001" w:tentative="1">
+      <w:start w:val="1"/>
+      <w:numFmt w:val="bullet"/>
+      <w:lvlText w:val=""/>
+      <w:lvlJc w:val="left"/>
+      <w:pPr>
+        <w:ind w:left="3600" w:hanging="360"/>
+      </w:pPr>
+      <w:rPr>
+        <w:rFonts w:ascii="Symbol" w:hAnsi="Symbol" w:hint="default"/>
+      </w:rPr>
+    </w:lvl>
+    <w:lvl w:ilvl="4" w:tplc="04090003" w:tentative="1">
+      <w:start w:val="1"/>
+      <w:numFmt w:val="bullet"/>
+      <w:lvlText w:val="o"/>
+      <w:lvlJc w:val="left"/>
+      <w:pPr>
+        <w:ind w:left="4320" w:hanging="360"/>
+      </w:pPr>
+      <w:rPr>
+        <w:rFonts w:ascii="Courier New" w:hAnsi="Courier New" w:cs="Courier New" w:hint="default"/>
+      </w:rPr>
+    </w:lvl>
+    <w:lvl w:ilvl="5" w:tplc="04090005" w:tentative="1">
+      <w:start w:val="1"/>
+      <w:numFmt w:val="bullet"/>
+      <w:lvlText w:val=""/>
+      <w:lvlJc w:val="left"/>
+      <w:pPr>
+        <w:ind w:left="5040" w:hanging="360"/>
+      </w:pPr>
+      <w:rPr>
+        <w:rFonts w:ascii="Wingdings" w:hAnsi="Wingdings" w:hint="default"/>
+      </w:rPr>
+    </w:lvl>
+    <w:lvl w:ilvl="6" w:tplc="04090001" w:tentative="1">
+      <w:start w:val="1"/>
+      <w:numFmt w:val="bullet"/>
+      <w:lvlText w:val=""/>
+      <w:lvlJc w:val="left"/>
+      <w:pPr>
+        <w:ind w:left="5760" w:hanging="360"/>
+      </w:pPr>
+      <w:rPr>
+        <w:rFonts w:ascii="Symbol" w:hAnsi="Symbol" w:hint="default"/>
+      </w:rPr>
+    </w:lvl>
+    <w:lvl w:ilvl="7" w:tplc="04090003" w:tentative="1">
+      <w:start w:val="1"/>
+      <w:numFmt w:val="bullet"/>
+      <w:lvlText w:val="o"/>
+      <w:lvlJc w:val="left"/>
+      <w:pPr>
+        <w:ind w:left="6480" w:hanging="360"/>
+      </w:pPr>
+      <w:rPr>
+        <w:rFonts w:ascii="Courier New" w:hAnsi="Courier New" w:cs="Courier New" w:hint="default"/>
+      </w:rPr>
+    </w:lvl>
+    <w:lvl w:ilvl="8" w:tplc="04090005" w:tentative="1">
+      <w:start w:val="1"/>
+      <w:numFmt w:val="bullet"/>
+      <w:lvlText w:val=""/>
+      <w:lvlJc w:val="left"/>
+      <w:pPr>
+        <w:ind w:left="7200" w:hanging="360"/>
+      </w:pPr>
+      <w:rPr>
+        <w:rFonts w:ascii="Wingdings" w:hAnsi="Wingdings" w:hint="default"/>
+      </w:rPr>
+    </w:lvl>
+  </w:abstractNum>
+  <w:abstractNum w:abstractNumId="6" w15:restartNumberingAfterBreak="0">
     <w:nsid w:val="28AE655A"/>
     <w:multiLevelType w:val="multilevel"/>
     <w:tmpl w:val="D23616F2"/>
@@ -18647,7 +20246,7 @@
       </w:rPr>
     </w:lvl>
   </w:abstractNum>
-  <w:abstractNum w:abstractNumId="6" w15:restartNumberingAfterBreak="0">
+  <w:abstractNum w:abstractNumId="7" w15:restartNumberingAfterBreak="0">
     <w:nsid w:val="2E151A3E"/>
     <w:multiLevelType w:val="multilevel"/>
     <w:tmpl w:val="FEB4F122"/>
@@ -18796,7 +20395,7 @@
       </w:rPr>
     </w:lvl>
   </w:abstractNum>
-  <w:abstractNum w:abstractNumId="7" w15:restartNumberingAfterBreak="0">
+  <w:abstractNum w:abstractNumId="8" w15:restartNumberingAfterBreak="0">
     <w:nsid w:val="2E505EED"/>
     <w:multiLevelType w:val="multilevel"/>
     <w:tmpl w:val="DDE4FA5C"/>
@@ -18945,7 +20544,7 @@
       </w:rPr>
     </w:lvl>
   </w:abstractNum>
-  <w:abstractNum w:abstractNumId="8" w15:restartNumberingAfterBreak="0">
+  <w:abstractNum w:abstractNumId="9" w15:restartNumberingAfterBreak="0">
     <w:nsid w:val="2F785772"/>
     <w:multiLevelType w:val="hybridMultilevel"/>
     <w:tmpl w:val="D69CDE32"/>
@@ -19058,7 +20657,7 @@
       </w:rPr>
     </w:lvl>
   </w:abstractNum>
-  <w:abstractNum w:abstractNumId="9" w15:restartNumberingAfterBreak="0">
+  <w:abstractNum w:abstractNumId="10" w15:restartNumberingAfterBreak="0">
     <w:nsid w:val="30F43A08"/>
     <w:multiLevelType w:val="multilevel"/>
     <w:tmpl w:val="090C70A8"/>
@@ -19207,7 +20806,7 @@
       </w:rPr>
     </w:lvl>
   </w:abstractNum>
-  <w:abstractNum w:abstractNumId="10" w15:restartNumberingAfterBreak="0">
+  <w:abstractNum w:abstractNumId="11" w15:restartNumberingAfterBreak="0">
     <w:nsid w:val="3531528C"/>
     <w:multiLevelType w:val="multilevel"/>
     <w:tmpl w:val="FBD22B66"/>
@@ -19356,7 +20955,7 @@
       </w:rPr>
     </w:lvl>
   </w:abstractNum>
-  <w:abstractNum w:abstractNumId="11" w15:restartNumberingAfterBreak="0">
+  <w:abstractNum w:abstractNumId="12" w15:restartNumberingAfterBreak="0">
     <w:nsid w:val="36DC452D"/>
     <w:multiLevelType w:val="hybridMultilevel"/>
     <w:tmpl w:val="1A327908"/>
@@ -19442,7 +21041,7 @@
       </w:pPr>
     </w:lvl>
   </w:abstractNum>
-  <w:abstractNum w:abstractNumId="12" w15:restartNumberingAfterBreak="0">
+  <w:abstractNum w:abstractNumId="13" w15:restartNumberingAfterBreak="0">
     <w:nsid w:val="37433A33"/>
     <w:multiLevelType w:val="hybridMultilevel"/>
     <w:tmpl w:val="26447A30"/>
@@ -19555,7 +21154,7 @@
       </w:rPr>
     </w:lvl>
   </w:abstractNum>
-  <w:abstractNum w:abstractNumId="13" w15:restartNumberingAfterBreak="0">
+  <w:abstractNum w:abstractNumId="14" w15:restartNumberingAfterBreak="0">
     <w:nsid w:val="39ED0280"/>
     <w:multiLevelType w:val="multilevel"/>
     <w:tmpl w:val="108C4CE6"/>
@@ -19704,7 +21303,7 @@
       </w:rPr>
     </w:lvl>
   </w:abstractNum>
-  <w:abstractNum w:abstractNumId="14" w15:restartNumberingAfterBreak="0">
+  <w:abstractNum w:abstractNumId="15" w15:restartNumberingAfterBreak="0">
     <w:nsid w:val="471662C5"/>
     <w:multiLevelType w:val="hybridMultilevel"/>
     <w:tmpl w:val="B4AA7364"/>
@@ -19817,7 +21416,7 @@
       </w:rPr>
     </w:lvl>
   </w:abstractNum>
-  <w:abstractNum w:abstractNumId="15" w15:restartNumberingAfterBreak="0">
+  <w:abstractNum w:abstractNumId="16" w15:restartNumberingAfterBreak="0">
     <w:nsid w:val="49201661"/>
     <w:multiLevelType w:val="hybridMultilevel"/>
     <w:tmpl w:val="8BE200C0"/>
@@ -19903,7 +21502,7 @@
       </w:pPr>
     </w:lvl>
   </w:abstractNum>
-  <w:abstractNum w:abstractNumId="16" w15:restartNumberingAfterBreak="0">
+  <w:abstractNum w:abstractNumId="17" w15:restartNumberingAfterBreak="0">
     <w:nsid w:val="552D6E33"/>
     <w:multiLevelType w:val="multilevel"/>
     <w:tmpl w:val="BA2A4FB4"/>
@@ -20052,7 +21651,7 @@
       </w:rPr>
     </w:lvl>
   </w:abstractNum>
-  <w:abstractNum w:abstractNumId="17" w15:restartNumberingAfterBreak="0">
+  <w:abstractNum w:abstractNumId="18" w15:restartNumberingAfterBreak="0">
     <w:nsid w:val="58AC7B75"/>
     <w:multiLevelType w:val="hybridMultilevel"/>
     <w:tmpl w:val="33C8D160"/>
@@ -20165,7 +21764,7 @@
       </w:rPr>
     </w:lvl>
   </w:abstractNum>
-  <w:abstractNum w:abstractNumId="18" w15:restartNumberingAfterBreak="0">
+  <w:abstractNum w:abstractNumId="19" w15:restartNumberingAfterBreak="0">
     <w:nsid w:val="63877B2C"/>
     <w:multiLevelType w:val="hybridMultilevel"/>
     <w:tmpl w:val="8BE200C0"/>
@@ -20251,7 +21850,7 @@
       </w:pPr>
     </w:lvl>
   </w:abstractNum>
-  <w:abstractNum w:abstractNumId="19" w15:restartNumberingAfterBreak="0">
+  <w:abstractNum w:abstractNumId="20" w15:restartNumberingAfterBreak="0">
     <w:nsid w:val="6F153F0E"/>
     <w:multiLevelType w:val="multilevel"/>
     <w:tmpl w:val="99D8759C"/>
@@ -20400,7 +21999,7 @@
       </w:rPr>
     </w:lvl>
   </w:abstractNum>
-  <w:abstractNum w:abstractNumId="20" w15:restartNumberingAfterBreak="0">
+  <w:abstractNum w:abstractNumId="21" w15:restartNumberingAfterBreak="0">
     <w:nsid w:val="7C6D24DC"/>
     <w:multiLevelType w:val="hybridMultilevel"/>
     <w:tmpl w:val="679AE626"/>
@@ -20514,13 +22113,13 @@
     </w:lvl>
   </w:abstractNum>
   <w:num w:numId="1" w16cid:durableId="432944788">
-    <w:abstractNumId w:val="7"/>
+    <w:abstractNumId w:val="8"/>
   </w:num>
   <w:num w:numId="2" w16cid:durableId="445585926">
     <w:abstractNumId w:val="4"/>
   </w:num>
   <w:num w:numId="3" w16cid:durableId="244804848">
-    <w:abstractNumId w:val="16"/>
+    <w:abstractNumId w:val="17"/>
   </w:num>
   <w:num w:numId="4" w16cid:durableId="1242175075">
     <w:abstractNumId w:val="1"/>
@@ -20532,49 +22131,52 @@
     <w:abstractNumId w:val="2"/>
   </w:num>
   <w:num w:numId="7" w16cid:durableId="2128892915">
-    <w:abstractNumId w:val="8"/>
+    <w:abstractNumId w:val="9"/>
   </w:num>
   <w:num w:numId="8" w16cid:durableId="1976836468">
     <w:abstractNumId w:val="3"/>
   </w:num>
   <w:num w:numId="9" w16cid:durableId="985282551">
+    <w:abstractNumId w:val="15"/>
+  </w:num>
+  <w:num w:numId="10" w16cid:durableId="304315213">
+    <w:abstractNumId w:val="21"/>
+  </w:num>
+  <w:num w:numId="11" w16cid:durableId="1056128272">
+    <w:abstractNumId w:val="18"/>
+  </w:num>
+  <w:num w:numId="12" w16cid:durableId="1114985479">
+    <w:abstractNumId w:val="20"/>
+  </w:num>
+  <w:num w:numId="13" w16cid:durableId="896665628">
+    <w:abstractNumId w:val="10"/>
+  </w:num>
+  <w:num w:numId="14" w16cid:durableId="1074738736">
+    <w:abstractNumId w:val="6"/>
+  </w:num>
+  <w:num w:numId="15" w16cid:durableId="36899040">
+    <w:abstractNumId w:val="13"/>
+  </w:num>
+  <w:num w:numId="16" w16cid:durableId="1162352031">
+    <w:abstractNumId w:val="12"/>
+  </w:num>
+  <w:num w:numId="17" w16cid:durableId="1022171822">
+    <w:abstractNumId w:val="16"/>
+  </w:num>
+  <w:num w:numId="18" w16cid:durableId="1294365804">
     <w:abstractNumId w:val="14"/>
   </w:num>
-  <w:num w:numId="10" w16cid:durableId="304315213">
-    <w:abstractNumId w:val="20"/>
-  </w:num>
-  <w:num w:numId="11" w16cid:durableId="1056128272">
-    <w:abstractNumId w:val="17"/>
-  </w:num>
-  <w:num w:numId="12" w16cid:durableId="1114985479">
+  <w:num w:numId="19" w16cid:durableId="593822069">
     <w:abstractNumId w:val="19"/>
   </w:num>
-  <w:num w:numId="13" w16cid:durableId="896665628">
-    <w:abstractNumId w:val="9"/>
-  </w:num>
-  <w:num w:numId="14" w16cid:durableId="1074738736">
-    <w:abstractNumId w:val="5"/>
-  </w:num>
-  <w:num w:numId="15" w16cid:durableId="36899040">
-    <w:abstractNumId w:val="12"/>
-  </w:num>
-  <w:num w:numId="16" w16cid:durableId="1162352031">
+  <w:num w:numId="20" w16cid:durableId="873275942">
     <w:abstractNumId w:val="11"/>
   </w:num>
-  <w:num w:numId="17" w16cid:durableId="1022171822">
-    <w:abstractNumId w:val="15"/>
+  <w:num w:numId="21" w16cid:durableId="913661414">
+    <w:abstractNumId w:val="7"/>
   </w:num>
-  <w:num w:numId="18" w16cid:durableId="1294365804">
-    <w:abstractNumId w:val="13"/>
-  </w:num>
-  <w:num w:numId="19" w16cid:durableId="593822069">
-    <w:abstractNumId w:val="18"/>
-  </w:num>
-  <w:num w:numId="20" w16cid:durableId="873275942">
-    <w:abstractNumId w:val="10"/>
-  </w:num>
-  <w:num w:numId="21" w16cid:durableId="913661414">
-    <w:abstractNumId w:val="6"/>
+  <w:num w:numId="22" w16cid:durableId="2060201940">
+    <w:abstractNumId w:val="5"/>
   </w:num>
 </w:numbering>
 </file>

</xml_diff>